<commit_message>
assign a 'due date' even for payers who do not have an IBAN or a mandate, #180
</commit_message>
<xml_diff>
--- a/docs/documentation-en.docx
+++ b/docs/documentation-en.docx
@@ -753,7 +753,7 @@
     </w:p>
     <w:p>
       <w:pPr>
-        <w:pStyle w:val="Verzeichnis"/>
+        <w:pStyle w:val="Verzeichnisuser"/>
         <w:rPr/>
       </w:pPr>
       <w:r>
@@ -773,7 +773,7 @@
     </w:p>
     <w:p>
       <w:pPr>
-        <w:pStyle w:val="Verzeichnis"/>
+        <w:pStyle w:val="Verzeichnisuser"/>
         <w:rPr/>
       </w:pPr>
       <w:r>
@@ -805,7 +805,7 @@
     </w:p>
     <w:p>
       <w:pPr>
-        <w:pStyle w:val="Verzeichnis"/>
+        <w:pStyle w:val="Verzeichnisuser"/>
         <w:rPr/>
       </w:pPr>
       <w:r>
@@ -837,7 +837,7 @@
     </w:p>
     <w:p>
       <w:pPr>
-        <w:pStyle w:val="Verzeichnis"/>
+        <w:pStyle w:val="Verzeichnisuser"/>
         <w:rPr/>
       </w:pPr>
       <w:r>
@@ -884,7 +884,7 @@
     </w:p>
     <w:p>
       <w:pPr>
-        <w:pStyle w:val="Verzeichnis"/>
+        <w:pStyle w:val="Verzeichnisuser"/>
         <w:rPr/>
       </w:pPr>
       <w:r>
@@ -899,7 +899,7 @@
     </w:p>
     <w:p>
       <w:pPr>
-        <w:pStyle w:val="Verzeichnis"/>
+        <w:pStyle w:val="Verzeichnisuser"/>
         <w:rPr/>
       </w:pPr>
       <w:r>
@@ -959,7 +959,7 @@
     </w:p>
     <w:p>
       <w:pPr>
-        <w:pStyle w:val="Verzeichnis"/>
+        <w:pStyle w:val="Verzeichnisuser"/>
         <w:rPr/>
       </w:pPr>
       <w:r>
@@ -982,7 +982,7 @@
     </w:p>
     <w:p>
       <w:pPr>
-        <w:pStyle w:val="Verzeichnis"/>
+        <w:pStyle w:val="Verzeichnisuser"/>
         <w:rPr/>
       </w:pPr>
       <w:r>
@@ -1014,7 +1014,7 @@
     </w:p>
     <w:p>
       <w:pPr>
-        <w:pStyle w:val="Verzeichnis"/>
+        <w:pStyle w:val="Verzeichnisuser"/>
         <w:rPr/>
       </w:pPr>
       <w:r>
@@ -1037,7 +1037,7 @@
     </w:p>
     <w:p>
       <w:pPr>
-        <w:pStyle w:val="Verzeichnis"/>
+        <w:pStyle w:val="Verzeichnisuser"/>
         <w:bidi w:val="0"/>
         <w:jc w:val="left"/>
         <w:rPr>
@@ -1468,7 +1468,7 @@
               </w:rPr>
               <w:t>Export menu</w:t>
               <w:tab/>
-              <w:t>14</w:t>
+              <w:t>15</w:t>
             </w:r>
           </w:hyperlink>
         </w:p>
@@ -2128,7 +2128,7 @@
               </w:rPr>
               <w:t>Due date</w:t>
               <w:tab/>
-              <w:t>30</w:t>
+              <w:t>31</w:t>
             </w:r>
           </w:hyperlink>
         </w:p>
@@ -2148,7 +2148,7 @@
               </w:rPr>
               <w:t>XML file</w:t>
               <w:tab/>
-              <w:t>32</w:t>
+              <w:t>33</w:t>
             </w:r>
           </w:hyperlink>
         </w:p>
@@ -2168,7 +2168,7 @@
               </w:rPr>
               <w:t>Control file</w:t>
               <w:tab/>
-              <w:t>32</w:t>
+              <w:t>33</w:t>
             </w:r>
           </w:hyperlink>
         </w:p>
@@ -2188,7 +2188,7 @@
               </w:rPr>
               <w:t>Pre-notification</w:t>
               <w:tab/>
-              <w:t>33</w:t>
+              <w:t>34</w:t>
             </w:r>
           </w:hyperlink>
         </w:p>
@@ -2208,7 +2208,7 @@
               </w:rPr>
               <w:t>Invoice</w:t>
               <w:tab/>
-              <w:t>35</w:t>
+              <w:t>36</w:t>
             </w:r>
           </w:hyperlink>
         </w:p>
@@ -2228,7 +2228,7 @@
               </w:rPr>
               <w:t>The Export button</w:t>
               <w:tab/>
-              <w:t>35</w:t>
+              <w:t>36</w:t>
             </w:r>
           </w:hyperlink>
         </w:p>
@@ -2248,7 +2248,7 @@
               </w:rPr>
               <w:t>The E-mail button</w:t>
               <w:tab/>
-              <w:t>35</w:t>
+              <w:t>36</w:t>
             </w:r>
           </w:hyperlink>
         </w:p>
@@ -2268,7 +2268,7 @@
               </w:rPr>
               <w:t>Mandate management</w:t>
               <w:tab/>
-              <w:t>37</w:t>
+              <w:t>38</w:t>
             </w:r>
           </w:hyperlink>
         </w:p>
@@ -2288,7 +2288,7 @@
               </w:rPr>
               <w:t>Create mandate references</w:t>
               <w:tab/>
-              <w:t>37</w:t>
+              <w:t>38</w:t>
             </w:r>
           </w:hyperlink>
         </w:p>
@@ -2308,7 +2308,7 @@
               </w:rPr>
               <w:t>Edit mandate</w:t>
               <w:tab/>
-              <w:t>38</w:t>
+              <w:t>39</w:t>
             </w:r>
           </w:hyperlink>
         </w:p>
@@ -2328,7 +2328,7 @@
               </w:rPr>
               <w:t>Options</w:t>
               <w:tab/>
-              <w:t>39</w:t>
+              <w:t>40</w:t>
             </w:r>
           </w:hyperlink>
         </w:p>
@@ -2348,7 +2348,7 @@
               </w:rPr>
               <w:t>Generate membership number(s).</w:t>
               <w:tab/>
-              <w:t>39</w:t>
+              <w:t>40</w:t>
             </w:r>
           </w:hyperlink>
         </w:p>
@@ -2368,7 +2368,7 @@
               </w:rPr>
               <w:t>Update family roles</w:t>
               <w:tab/>
-              <w:t>40</w:t>
+              <w:t>41</w:t>
             </w:r>
           </w:hyperlink>
         </w:p>
@@ -2388,7 +2388,7 @@
               </w:rPr>
               <w:t>Copy</w:t>
               <w:tab/>
-              <w:t>41</w:t>
+              <w:t>42</w:t>
             </w:r>
           </w:hyperlink>
         </w:p>
@@ -2408,7 +2408,7 @@
               </w:rPr>
               <w:t>Tests</w:t>
               <w:tab/>
-              <w:t>42</w:t>
+              <w:t>43</w:t>
             </w:r>
           </w:hyperlink>
         </w:p>
@@ -2428,7 +2428,7 @@
               </w:rPr>
               <w:t>Age-bases roles</w:t>
               <w:tab/>
-              <w:t>42</w:t>
+              <w:t>43</w:t>
             </w:r>
           </w:hyperlink>
         </w:p>
@@ -2448,7 +2448,7 @@
               </w:rPr>
               <w:t>Role membership (age-based roles)</w:t>
               <w:tab/>
-              <w:t>42</w:t>
+              <w:t>43</w:t>
             </w:r>
           </w:hyperlink>
         </w:p>
@@ -2468,7 +2468,7 @@
               </w:rPr>
               <w:t>Role membership (mandatory)</w:t>
               <w:tab/>
-              <w:t>42</w:t>
+              <w:t>43</w:t>
             </w:r>
           </w:hyperlink>
         </w:p>
@@ -2488,7 +2488,7 @@
               </w:rPr>
               <w:t>Role membership (exclusion)</w:t>
               <w:tab/>
-              <w:t>42</w:t>
+              <w:t>43</w:t>
             </w:r>
           </w:hyperlink>
         </w:p>
@@ -2508,7 +2508,7 @@
               </w:rPr>
               <w:t>Family roles</w:t>
               <w:tab/>
-              <w:t>42</w:t>
+              <w:t>43</w:t>
             </w:r>
           </w:hyperlink>
         </w:p>
@@ -2528,7 +2528,7 @@
               </w:rPr>
               <w:t>Account details</w:t>
               <w:tab/>
-              <w:t>42</w:t>
+              <w:t>43</w:t>
             </w:r>
           </w:hyperlink>
         </w:p>
@@ -2548,7 +2548,7 @@
               </w:rPr>
               <w:t>Mandate management</w:t>
               <w:tab/>
-              <w:t>42</w:t>
+              <w:t>43</w:t>
             </w:r>
           </w:hyperlink>
         </w:p>
@@ -2568,7 +2568,7 @@
               </w:rPr>
               <w:t>IBAN test</w:t>
               <w:tab/>
-              <w:t>42</w:t>
+              <w:t>43</w:t>
             </w:r>
           </w:hyperlink>
         </w:p>
@@ -2588,7 +2588,7 @@
               </w:rPr>
               <w:t>BIC test</w:t>
               <w:tab/>
-              <w:t>43</w:t>
+              <w:t>44</w:t>
             </w:r>
           </w:hyperlink>
         </w:p>
@@ -2608,7 +2608,7 @@
               </w:rPr>
               <w:t>Overview of roles</w:t>
               <w:tab/>
-              <w:t>44</w:t>
+              <w:t>45</w:t>
             </w:r>
           </w:hyperlink>
         </w:p>
@@ -2628,7 +2628,7 @@
               </w:rPr>
               <w:t>Plugin information</w:t>
               <w:tab/>
-              <w:t>44</w:t>
+              <w:t>45</w:t>
             </w:r>
           </w:hyperlink>
         </w:p>
@@ -2648,7 +2648,7 @@
               </w:rPr>
               <w:t>Preferences</w:t>
               <w:tab/>
-              <w:t>45</w:t>
+              <w:t>46</w:t>
             </w:r>
           </w:hyperlink>
         </w:p>
@@ -2668,7 +2668,7 @@
               </w:rPr>
               <w:t>Contribution settings</w:t>
               <w:tab/>
-              <w:t>45</w:t>
+              <w:t>46</w:t>
             </w:r>
           </w:hyperlink>
         </w:p>
@@ -2688,7 +2688,7 @@
               </w:rPr>
               <w:t>Age-based roles</w:t>
               <w:tab/>
-              <w:t>45</w:t>
+              <w:t>46</w:t>
             </w:r>
           </w:hyperlink>
         </w:p>
@@ -2708,7 +2708,7 @@
               </w:rPr>
               <w:t>Family roles</w:t>
               <w:tab/>
-              <w:t>46</w:t>
+              <w:t>47</w:t>
             </w:r>
           </w:hyperlink>
         </w:p>
@@ -2728,7 +2728,7 @@
               </w:rPr>
               <w:t>Multiplier roles</w:t>
               <w:tab/>
-              <w:t>46</w:t>
+              <w:t>47</w:t>
             </w:r>
           </w:hyperlink>
         </w:p>
@@ -2748,7 +2748,7 @@
               </w:rPr>
               <w:t>Advanced role editing</w:t>
               <w:tab/>
-              <w:t>46</w:t>
+              <w:t>47</w:t>
             </w:r>
           </w:hyperlink>
         </w:p>
@@ -2768,7 +2768,7 @@
               </w:rPr>
               <w:t>Apointment selection</w:t>
               <w:tab/>
-              <w:t>47</w:t>
+              <w:t>48</w:t>
             </w:r>
           </w:hyperlink>
         </w:p>
@@ -2788,7 +2788,7 @@
               </w:rPr>
               <w:t>Individual contributions</w:t>
               <w:tab/>
-              <w:t>47</w:t>
+              <w:t>48</w:t>
             </w:r>
           </w:hyperlink>
         </w:p>
@@ -2808,7 +2808,7 @@
               </w:rPr>
               <w:t>Account details</w:t>
               <w:tab/>
-              <w:t>48</w:t>
+              <w:t>49</w:t>
             </w:r>
           </w:hyperlink>
         </w:p>
@@ -2828,7 +2828,7 @@
               </w:rPr>
               <w:t>Mandate management</w:t>
               <w:tab/>
-              <w:t>50</w:t>
+              <w:t>51</w:t>
             </w:r>
           </w:hyperlink>
         </w:p>
@@ -2848,7 +2848,7 @@
               </w:rPr>
               <w:t>The prefix</w:t>
               <w:tab/>
-              <w:t>50</w:t>
+              <w:t>51</w:t>
             </w:r>
           </w:hyperlink>
         </w:p>
@@ -2868,7 +2868,7 @@
               </w:rPr>
               <w:t>The zeros</w:t>
               <w:tab/>
-              <w:t>50</w:t>
+              <w:t>51</w:t>
             </w:r>
           </w:hyperlink>
         </w:p>
@@ -2888,7 +2888,7 @@
               </w:rPr>
               <w:t>The sequential number</w:t>
               <w:tab/>
-              <w:t>50</w:t>
+              <w:t>51</w:t>
             </w:r>
           </w:hyperlink>
         </w:p>
@@ -2908,7 +2908,7 @@
               </w:rPr>
               <w:t>View definitions</w:t>
               <w:tab/>
-              <w:t>51</w:t>
+              <w:t>52</w:t>
             </w:r>
           </w:hyperlink>
         </w:p>
@@ -2928,7 +2928,7 @@
               </w:rPr>
               <w:t>Export</w:t>
               <w:tab/>
-              <w:t>51</w:t>
+              <w:t>52</w:t>
             </w:r>
           </w:hyperlink>
         </w:p>
@@ -2948,7 +2948,7 @@
               </w:rPr>
               <w:t>Email notifications</w:t>
               <w:tab/>
-              <w:t>52</w:t>
+              <w:t>53</w:t>
             </w:r>
           </w:hyperlink>
         </w:p>
@@ -2968,7 +2968,7 @@
               </w:rPr>
               <w:t>Tests</w:t>
               <w:tab/>
-              <w:t>52</w:t>
+              <w:t>53</w:t>
             </w:r>
           </w:hyperlink>
         </w:p>
@@ -2988,7 +2988,7 @@
               </w:rPr>
               <w:t>Enable tests</w:t>
               <w:tab/>
-              <w:t>52</w:t>
+              <w:t>53</w:t>
             </w:r>
           </w:hyperlink>
         </w:p>
@@ -3008,7 +3008,7 @@
               </w:rPr>
               <w:t>Role membership (age-based roles)</w:t>
               <w:tab/>
-              <w:t>53</w:t>
+              <w:t>54</w:t>
             </w:r>
           </w:hyperlink>
         </w:p>
@@ -3028,7 +3028,7 @@
               </w:rPr>
               <w:t>Role membership (mandatory) and Role membership (exclusion)</w:t>
               <w:tab/>
-              <w:t>53</w:t>
+              <w:t>54</w:t>
             </w:r>
           </w:hyperlink>
         </w:p>
@@ -3048,7 +3048,7 @@
               </w:rPr>
               <w:t>Family roles</w:t>
               <w:tab/>
-              <w:t>54</w:t>
+              <w:t>55</w:t>
             </w:r>
           </w:hyperlink>
         </w:p>
@@ -3068,7 +3068,7 @@
               </w:rPr>
               <w:t>Access permission for preferences</w:t>
               <w:tab/>
-              <w:t>56</w:t>
+              <w:t>57</w:t>
             </w:r>
           </w:hyperlink>
         </w:p>
@@ -3088,7 +3088,7 @@
               </w:rPr>
               <w:t>Delete Amounts</w:t>
               <w:tab/>
-              <w:t>56</w:t>
+              <w:t>57</w:t>
             </w:r>
           </w:hyperlink>
         </w:p>
@@ -3108,7 +3108,7 @@
               </w:rPr>
               <w:t>Uninstall</w:t>
               <w:tab/>
-              <w:t>57</w:t>
+              <w:t>58</w:t>
             </w:r>
           </w:hyperlink>
         </w:p>
@@ -3128,7 +3128,7 @@
               </w:rPr>
               <w:t>Saving the configuration</w:t>
               <w:tab/>
-              <w:t>58</w:t>
+              <w:t>59</w:t>
             </w:r>
           </w:hyperlink>
         </w:p>
@@ -3148,7 +3148,7 @@
               </w:rPr>
               <w:t>Information on contribution calculation on the overview page</w:t>
               <w:tab/>
-              <w:t>59</w:t>
+              <w:t>60</w:t>
             </w:r>
           </w:hyperlink>
         </w:p>
@@ -3168,7 +3168,7 @@
               </w:rPr>
               <w:t>Procedure for a contribution calculation</w:t>
               <w:tab/>
-              <w:t>60</w:t>
+              <w:t>61</w:t>
             </w:r>
           </w:hyperlink>
         </w:p>
@@ -3188,7 +3188,7 @@
               </w:rPr>
               <w:t>Rough process</w:t>
               <w:tab/>
-              <w:t>60</w:t>
+              <w:t>61</w:t>
             </w:r>
           </w:hyperlink>
         </w:p>
@@ -3214,7 +3214,7 @@
               </w:rPr>
               <w:t>Schedule</w:t>
               <w:tab/>
-              <w:t>60</w:t>
+              <w:t>61</w:t>
             </w:r>
           </w:hyperlink>
         </w:p>
@@ -3234,7 +3234,7 @@
               </w:rPr>
               <w:t>Admission of the new member</w:t>
               <w:tab/>
-              <w:t>60</w:t>
+              <w:t>61</w:t>
             </w:r>
           </w:hyperlink>
         </w:p>
@@ -3254,7 +3254,7 @@
               </w:rPr>
               <w:t>Generate membership number</w:t>
               <w:tab/>
-              <w:t>60</w:t>
+              <w:t>61</w:t>
             </w:r>
           </w:hyperlink>
         </w:p>
@@ -3274,7 +3274,7 @@
               </w:rPr>
               <w:t>Create mandate reference</w:t>
               <w:tab/>
-              <w:t>60</w:t>
+              <w:t>61</w:t>
             </w:r>
           </w:hyperlink>
         </w:p>
@@ -3294,7 +3294,7 @@
               </w:rPr>
               <w:t>Enter mandate date</w:t>
               <w:tab/>
-              <w:t>60</w:t>
+              <w:t>61</w:t>
             </w:r>
           </w:hyperlink>
         </w:p>
@@ -3314,7 +3314,7 @@
               </w:rPr>
               <w:t>Perform remapping</w:t>
               <w:tab/>
-              <w:t>61</w:t>
+              <w:t>62</w:t>
             </w:r>
           </w:hyperlink>
         </w:p>
@@ -3334,7 +3334,7 @@
               </w:rPr>
               <w:t>Contribution calculation</w:t>
               <w:tab/>
-              <w:t>61</w:t>
+              <w:t>62</w:t>
             </w:r>
           </w:hyperlink>
         </w:p>
@@ -3354,7 +3354,7 @@
               </w:rPr>
               <w:t>Due Date</w:t>
               <w:tab/>
-              <w:t>61</w:t>
+              <w:t>62</w:t>
             </w:r>
           </w:hyperlink>
         </w:p>
@@ -3374,7 +3374,7 @@
               </w:rPr>
               <w:t>XML file</w:t>
               <w:tab/>
-              <w:t>61</w:t>
+              <w:t>62</w:t>
             </w:r>
           </w:hyperlink>
         </w:p>
@@ -3394,7 +3394,7 @@
               </w:rPr>
               <w:t>Pre-notification</w:t>
               <w:tab/>
-              <w:t>61</w:t>
+              <w:t>62</w:t>
             </w:r>
           </w:hyperlink>
         </w:p>
@@ -3414,7 +3414,7 @@
               </w:rPr>
               <w:t>Distribution of the XML file</w:t>
               <w:tab/>
-              <w:t>61</w:t>
+              <w:t>62</w:t>
             </w:r>
           </w:hyperlink>
         </w:p>
@@ -3434,7 +3434,7 @@
               </w:rPr>
               <w:t>Completion of a contribution calculation</w:t>
               <w:tab/>
-              <w:t>61</w:t>
+              <w:t>62</w:t>
             </w:r>
           </w:hyperlink>
           <w:r>
@@ -3448,7 +3448,7 @@
     </w:sdt>
     <w:p>
       <w:pPr>
-        <w:pStyle w:val="Verzeichnis"/>
+        <w:pStyle w:val="Verzeichnisuser"/>
         <w:rPr>
           <w:rFonts w:ascii="Arial" w:hAnsi="Arial"/>
           <w:sz w:val="20"/>
@@ -5531,7 +5531,7 @@
           <w:szCs w:val="20"/>
         </w:rPr>
         <w:drawing>
-          <wp:anchor distT="0" distB="0" distL="0" distR="0" simplePos="0" relativeHeight="107" behindDoc="0" locked="0" layoutInCell="0" allowOverlap="1">
+          <wp:anchor distT="0" distB="0" distL="0" distR="0" simplePos="0" relativeHeight="106" behindDoc="0" locked="0" layoutInCell="0" allowOverlap="1">
             <wp:simplePos x="0" y="0"/>
             <wp:positionH relativeFrom="column">
               <wp:posOffset>-6985</wp:posOffset>
@@ -6340,7 +6340,7 @@
           <w:numId w:val="0"/>
         </w:numPr>
         <w:suppressAutoHyphens w:val="true"/>
-        <w:overflowPunct w:val="false"/>
+        <w:overflowPunct w:val="true"/>
         <w:ind w:hanging="0" w:left="0"/>
         <w:jc w:val="both"/>
         <w:rPr/>
@@ -8026,7 +8026,7 @@
           <w:numId w:val="0"/>
         </w:numPr>
         <w:suppressAutoHyphens w:val="true"/>
-        <w:overflowPunct w:val="false"/>
+        <w:overflowPunct w:val="true"/>
         <w:ind w:hanging="0" w:left="0"/>
         <w:jc w:val="left"/>
         <w:rPr/>
@@ -9092,7 +9092,7 @@
       <w:r>
         <w:rPr/>
         <w:drawing>
-          <wp:anchor distT="0" distB="0" distL="0" distR="0" simplePos="0" relativeHeight="34" behindDoc="0" locked="0" layoutInCell="0" allowOverlap="1">
+          <wp:anchor distT="0" distB="0" distL="0" distR="0" simplePos="0" relativeHeight="33" behindDoc="0" locked="0" layoutInCell="0" allowOverlap="1">
             <wp:simplePos x="0" y="0"/>
             <wp:positionH relativeFrom="column">
               <wp:posOffset>-35560</wp:posOffset>
@@ -9258,7 +9258,7 @@
       <w:r>
         <w:rPr/>
         <w:drawing>
-          <wp:anchor distT="0" distB="0" distL="0" distR="0" simplePos="0" relativeHeight="35" behindDoc="0" locked="0" layoutInCell="0" allowOverlap="1">
+          <wp:anchor distT="0" distB="0" distL="0" distR="0" simplePos="0" relativeHeight="34" behindDoc="0" locked="0" layoutInCell="0" allowOverlap="1">
             <wp:simplePos x="0" y="0"/>
             <wp:positionH relativeFrom="column">
               <wp:posOffset>-43180</wp:posOffset>
@@ -9352,7 +9352,7 @@
       <w:r>
         <w:rPr/>
         <w:drawing>
-          <wp:anchor distT="0" distB="0" distL="0" distR="0" simplePos="0" relativeHeight="36" behindDoc="0" locked="0" layoutInCell="0" allowOverlap="1">
+          <wp:anchor distT="0" distB="0" distL="0" distR="0" simplePos="0" relativeHeight="35" behindDoc="0" locked="0" layoutInCell="0" allowOverlap="1">
             <wp:simplePos x="0" y="0"/>
             <wp:positionH relativeFrom="column">
               <wp:posOffset>39370</wp:posOffset>
@@ -9471,7 +9471,7 @@
       <w:r>
         <w:rPr/>
         <w:drawing>
-          <wp:anchor distT="0" distB="0" distL="0" distR="0" simplePos="0" relativeHeight="37" behindDoc="0" locked="0" layoutInCell="0" allowOverlap="1">
+          <wp:anchor distT="0" distB="0" distL="0" distR="0" simplePos="0" relativeHeight="36" behindDoc="0" locked="0" layoutInCell="0" allowOverlap="1">
             <wp:simplePos x="0" y="0"/>
             <wp:positionH relativeFrom="column">
               <wp:posOffset>-5080</wp:posOffset>
@@ -9542,6 +9542,19 @@
     <w:p>
       <w:pPr>
         <w:pStyle w:val="Heading2"/>
+        <w:rPr>
+          <w:rFonts w:ascii="Arial" w:hAnsi="Arial"/>
+        </w:rPr>
+      </w:pPr>
+      <w:r>
+        <w:rPr>
+          <w:rFonts w:ascii="Arial" w:hAnsi="Arial"/>
+        </w:rPr>
+      </w:r>
+    </w:p>
+    <w:p>
+      <w:pPr>
+        <w:pStyle w:val="Heading2"/>
         <w:numPr>
           <w:ilvl w:val="1"/>
           <w:numId w:val="3"/>
@@ -9550,23 +9563,6 @@
           <w:rFonts w:ascii="Arial" w:hAnsi="Arial"/>
         </w:rPr>
       </w:pPr>
-      <w:r>
-        <w:rPr>
-          <w:rFonts w:ascii="Arial" w:hAnsi="Arial"/>
-        </w:rPr>
-      </w:r>
-    </w:p>
-    <w:p>
-      <w:pPr>
-        <w:pStyle w:val="Heading2"/>
-        <w:numPr>
-          <w:ilvl w:val="1"/>
-          <w:numId w:val="3"/>
-        </w:numPr>
-        <w:rPr>
-          <w:rFonts w:ascii="Arial" w:hAnsi="Arial"/>
-        </w:rPr>
-      </w:pPr>
       <w:bookmarkStart w:id="19" w:name="__RefHeading___Toc1222_2975391565"/>
       <w:bookmarkEnd w:id="19"/>
       <w:r>
@@ -9592,7 +9588,7 @@
       <w:r>
         <w:rPr/>
         <w:drawing>
-          <wp:anchor distT="0" distB="0" distL="0" distR="0" simplePos="0" relativeHeight="38" behindDoc="0" locked="0" layoutInCell="0" allowOverlap="1">
+          <wp:anchor distT="0" distB="0" distL="0" distR="0" simplePos="0" relativeHeight="37" behindDoc="0" locked="0" layoutInCell="0" allowOverlap="1">
             <wp:simplePos x="0" y="0"/>
             <wp:positionH relativeFrom="column">
               <wp:posOffset>3810</wp:posOffset>
@@ -9706,7 +9702,7 @@
       <w:r>
         <w:rPr/>
         <w:drawing>
-          <wp:anchor distT="0" distB="0" distL="0" distR="0" simplePos="0" relativeHeight="39" behindDoc="0" locked="0" layoutInCell="0" allowOverlap="1">
+          <wp:anchor distT="0" distB="0" distL="0" distR="0" simplePos="0" relativeHeight="38" behindDoc="0" locked="0" layoutInCell="0" allowOverlap="1">
             <wp:simplePos x="0" y="0"/>
             <wp:positionH relativeFrom="column">
               <wp:posOffset>36195</wp:posOffset>
@@ -9842,7 +9838,7 @@
       <w:r>
         <w:rPr/>
         <w:drawing>
-          <wp:anchor distT="0" distB="0" distL="0" distR="0" simplePos="0" relativeHeight="40" behindDoc="0" locked="0" layoutInCell="0" allowOverlap="1">
+          <wp:anchor distT="0" distB="0" distL="0" distR="0" simplePos="0" relativeHeight="39" behindDoc="0" locked="0" layoutInCell="0" allowOverlap="1">
             <wp:simplePos x="0" y="0"/>
             <wp:positionH relativeFrom="column">
               <wp:posOffset>6985</wp:posOffset>
@@ -10988,7 +10984,7 @@
           <w:numId w:val="0"/>
         </w:numPr>
         <w:suppressAutoHyphens w:val="true"/>
-        <w:overflowPunct w:val="false"/>
+        <w:overflowPunct w:val="true"/>
         <w:bidi w:val="0"/>
         <w:ind w:hanging="0" w:left="0"/>
         <w:jc w:val="left"/>
@@ -11046,7 +11042,7 @@
       <w:r>
         <w:rPr/>
         <w:drawing>
-          <wp:anchor distT="0" distB="0" distL="0" distR="0" simplePos="0" relativeHeight="41" behindDoc="0" locked="0" layoutInCell="0" allowOverlap="1">
+          <wp:anchor distT="0" distB="0" distL="0" distR="0" simplePos="0" relativeHeight="40" behindDoc="0" locked="0" layoutInCell="0" allowOverlap="1">
             <wp:simplePos x="0" y="0"/>
             <wp:positionH relativeFrom="column">
               <wp:posOffset>-3810</wp:posOffset>
@@ -11183,7 +11179,7 @@
       <w:r>
         <w:rPr/>
         <w:drawing>
-          <wp:anchor distT="0" distB="0" distL="0" distR="0" simplePos="0" relativeHeight="42" behindDoc="0" locked="0" layoutInCell="0" allowOverlap="1">
+          <wp:anchor distT="0" distB="0" distL="0" distR="0" simplePos="0" relativeHeight="41" behindDoc="0" locked="0" layoutInCell="0" allowOverlap="1">
             <wp:simplePos x="0" y="0"/>
             <wp:positionH relativeFrom="column">
               <wp:posOffset>17780</wp:posOffset>
@@ -13262,7 +13258,7 @@
           <w:numId w:val="0"/>
         </w:numPr>
         <w:suppressAutoHyphens w:val="true"/>
-        <w:overflowPunct w:val="false"/>
+        <w:overflowPunct w:val="true"/>
         <w:ind w:hanging="0" w:left="0"/>
         <w:jc w:val="left"/>
         <w:rPr>
@@ -13306,7 +13302,7 @@
           <w:numId w:val="0"/>
         </w:numPr>
         <w:suppressAutoHyphens w:val="true"/>
-        <w:overflowPunct w:val="false"/>
+        <w:overflowPunct w:val="true"/>
         <w:ind w:hanging="0" w:left="0"/>
         <w:jc w:val="left"/>
         <w:rPr>
@@ -13648,7 +13644,7 @@
           <w:numId w:val="3"/>
         </w:numPr>
         <w:suppressAutoHyphens w:val="true"/>
-        <w:overflowPunct w:val="false"/>
+        <w:overflowPunct w:val="true"/>
         <w:ind w:hanging="0" w:left="0"/>
         <w:jc w:val="left"/>
         <w:rPr>
@@ -13670,7 +13666,7 @@
           <w:numId w:val="3"/>
         </w:numPr>
         <w:suppressAutoHyphens w:val="true"/>
-        <w:overflowPunct w:val="false"/>
+        <w:overflowPunct w:val="true"/>
         <w:ind w:hanging="0" w:left="0"/>
         <w:jc w:val="both"/>
         <w:rPr>
@@ -13695,7 +13691,7 @@
           <w:numId w:val="0"/>
         </w:numPr>
         <w:suppressAutoHyphens w:val="true"/>
-        <w:overflowPunct w:val="false"/>
+        <w:overflowPunct w:val="true"/>
         <w:ind w:hanging="0" w:left="0"/>
         <w:jc w:val="both"/>
         <w:rPr/>
@@ -13713,7 +13709,7 @@
           <w:numId w:val="0"/>
         </w:numPr>
         <w:suppressAutoHyphens w:val="true"/>
-        <w:overflowPunct w:val="false"/>
+        <w:overflowPunct w:val="true"/>
         <w:ind w:hanging="0" w:left="0"/>
         <w:jc w:val="both"/>
         <w:rPr/>
@@ -13766,7 +13762,7 @@
           <w:numId w:val="0"/>
         </w:numPr>
         <w:suppressAutoHyphens w:val="true"/>
-        <w:overflowPunct w:val="false"/>
+        <w:overflowPunct w:val="true"/>
         <w:ind w:hanging="0" w:left="0"/>
         <w:jc w:val="both"/>
         <w:rPr/>
@@ -13815,7 +13811,7 @@
           <w:numId w:val="22"/>
         </w:numPr>
         <w:suppressAutoHyphens w:val="true"/>
-        <w:overflowPunct w:val="false"/>
+        <w:overflowPunct w:val="true"/>
         <w:jc w:val="both"/>
         <w:rPr/>
       </w:pPr>
@@ -13861,7 +13857,7 @@
           <w:numId w:val="22"/>
         </w:numPr>
         <w:suppressAutoHyphens w:val="true"/>
-        <w:overflowPunct w:val="false"/>
+        <w:overflowPunct w:val="true"/>
         <w:jc w:val="both"/>
         <w:rPr/>
       </w:pPr>
@@ -13898,7 +13894,7 @@
           <w:numId w:val="0"/>
         </w:numPr>
         <w:suppressAutoHyphens w:val="true"/>
-        <w:overflowPunct w:val="false"/>
+        <w:overflowPunct w:val="true"/>
         <w:ind w:hanging="0" w:left="0"/>
         <w:jc w:val="both"/>
         <w:rPr/>
@@ -13936,7 +13932,7 @@
           <w:numId w:val="0"/>
         </w:numPr>
         <w:suppressAutoHyphens w:val="true"/>
-        <w:overflowPunct w:val="false"/>
+        <w:overflowPunct w:val="true"/>
         <w:ind w:hanging="0" w:left="0"/>
         <w:jc w:val="both"/>
         <w:rPr>
@@ -13956,7 +13952,7 @@
           <w:numId w:val="0"/>
         </w:numPr>
         <w:suppressAutoHyphens w:val="true"/>
-        <w:overflowPunct w:val="false"/>
+        <w:overflowPunct w:val="true"/>
         <w:ind w:hanging="0" w:left="0"/>
         <w:jc w:val="both"/>
         <w:rPr/>
@@ -13978,7 +13974,7 @@
           <w:numId w:val="0"/>
         </w:numPr>
         <w:suppressAutoHyphens w:val="true"/>
-        <w:overflowPunct w:val="false"/>
+        <w:overflowPunct w:val="true"/>
         <w:ind w:hanging="0" w:left="0"/>
         <w:jc w:val="both"/>
         <w:rPr/>
@@ -14034,7 +14030,7 @@
           <w:numId w:val="0"/>
         </w:numPr>
         <w:suppressAutoHyphens w:val="true"/>
-        <w:overflowPunct w:val="false"/>
+        <w:overflowPunct w:val="true"/>
         <w:spacing w:before="140" w:after="120"/>
         <w:ind w:hanging="0" w:left="0"/>
         <w:jc w:val="both"/>
@@ -14074,7 +14070,7 @@
           <w:numId w:val="0"/>
         </w:numPr>
         <w:suppressAutoHyphens w:val="true"/>
-        <w:overflowPunct w:val="false"/>
+        <w:overflowPunct w:val="true"/>
         <w:ind w:hanging="0" w:left="0"/>
         <w:jc w:val="both"/>
         <w:rPr/>
@@ -14130,7 +14126,7 @@
           <w:numId w:val="23"/>
         </w:numPr>
         <w:suppressAutoHyphens w:val="true"/>
-        <w:overflowPunct w:val="false"/>
+        <w:overflowPunct w:val="true"/>
         <w:jc w:val="both"/>
         <w:rPr/>
       </w:pPr>
@@ -14167,7 +14163,7 @@
           <w:numId w:val="23"/>
         </w:numPr>
         <w:suppressAutoHyphens w:val="true"/>
-        <w:overflowPunct w:val="false"/>
+        <w:overflowPunct w:val="true"/>
         <w:jc w:val="both"/>
         <w:rPr/>
       </w:pPr>
@@ -14204,7 +14200,7 @@
           <w:numId w:val="23"/>
         </w:numPr>
         <w:suppressAutoHyphens w:val="true"/>
-        <w:overflowPunct w:val="false"/>
+        <w:overflowPunct w:val="true"/>
         <w:jc w:val="both"/>
         <w:rPr/>
       </w:pPr>
@@ -14243,7 +14239,7 @@
           <w:numId w:val="0"/>
         </w:numPr>
         <w:suppressAutoHyphens w:val="true"/>
-        <w:overflowPunct w:val="false"/>
+        <w:overflowPunct w:val="true"/>
         <w:ind w:hanging="0" w:left="0"/>
         <w:jc w:val="both"/>
         <w:rPr>
@@ -14263,7 +14259,7 @@
           <w:numId w:val="0"/>
         </w:numPr>
         <w:suppressAutoHyphens w:val="true"/>
-        <w:overflowPunct w:val="false"/>
+        <w:overflowPunct w:val="true"/>
         <w:ind w:hanging="0" w:left="0"/>
         <w:jc w:val="both"/>
         <w:rPr/>
@@ -14285,7 +14281,7 @@
           <w:numId w:val="0"/>
         </w:numPr>
         <w:suppressAutoHyphens w:val="true"/>
-        <w:overflowPunct w:val="false"/>
+        <w:overflowPunct w:val="true"/>
         <w:ind w:hanging="0" w:left="0"/>
         <w:jc w:val="both"/>
         <w:rPr/>
@@ -14329,7 +14325,7 @@
           <w:numId w:val="0"/>
         </w:numPr>
         <w:suppressAutoHyphens w:val="true"/>
-        <w:overflowPunct w:val="false"/>
+        <w:overflowPunct w:val="true"/>
         <w:ind w:hanging="0" w:left="0"/>
         <w:jc w:val="left"/>
         <w:rPr>
@@ -14354,7 +14350,7 @@
           <w:numId w:val="0"/>
         </w:numPr>
         <w:suppressAutoHyphens w:val="true"/>
-        <w:overflowPunct w:val="false"/>
+        <w:overflowPunct w:val="true"/>
         <w:ind w:hanging="0" w:left="0"/>
         <w:jc w:val="center"/>
         <w:rPr>
@@ -14421,7 +14417,7 @@
           <w:numId w:val="0"/>
         </w:numPr>
         <w:suppressAutoHyphens w:val="true"/>
-        <w:overflowPunct w:val="false"/>
+        <w:overflowPunct w:val="true"/>
         <w:bidi w:val="0"/>
         <w:ind w:hanging="0" w:left="0"/>
         <w:jc w:val="left"/>
@@ -15843,7 +15839,7 @@
       <w:r>
         <w:rPr/>
         <w:drawing>
-          <wp:anchor distT="0" distB="0" distL="0" distR="0" simplePos="0" relativeHeight="43" behindDoc="0" locked="0" layoutInCell="0" allowOverlap="1">
+          <wp:anchor distT="0" distB="0" distL="0" distR="0" simplePos="0" relativeHeight="42" behindDoc="0" locked="0" layoutInCell="0" allowOverlap="1">
             <wp:simplePos x="0" y="0"/>
             <wp:positionH relativeFrom="column">
               <wp:posOffset>0</wp:posOffset>
@@ -15996,7 +15992,7 @@
       <w:r>
         <w:rPr/>
         <w:drawing>
-          <wp:anchor distT="0" distB="0" distL="0" distR="0" simplePos="0" relativeHeight="44" behindDoc="0" locked="0" layoutInCell="0" allowOverlap="1">
+          <wp:anchor distT="0" distB="0" distL="0" distR="0" simplePos="0" relativeHeight="43" behindDoc="0" locked="0" layoutInCell="0" allowOverlap="1">
             <wp:simplePos x="0" y="0"/>
             <wp:positionH relativeFrom="column">
               <wp:posOffset>36195</wp:posOffset>
@@ -16134,7 +16130,7 @@
       <w:r>
         <w:rPr/>
         <w:drawing>
-          <wp:anchor distT="0" distB="0" distL="0" distR="0" simplePos="0" relativeHeight="92" behindDoc="0" locked="0" layoutInCell="0" allowOverlap="1">
+          <wp:anchor distT="0" distB="0" distL="0" distR="0" simplePos="0" relativeHeight="91" behindDoc="0" locked="0" layoutInCell="0" allowOverlap="1">
             <wp:simplePos x="0" y="0"/>
             <wp:positionH relativeFrom="column">
               <wp:posOffset>21590</wp:posOffset>
@@ -16318,7 +16314,7 @@
       <w:r>
         <w:rPr/>
         <w:drawing>
-          <wp:anchor distT="0" distB="0" distL="0" distR="0" simplePos="0" relativeHeight="94" behindDoc="0" locked="0" layoutInCell="0" allowOverlap="1">
+          <wp:anchor distT="0" distB="0" distL="0" distR="0" simplePos="0" relativeHeight="93" behindDoc="0" locked="0" layoutInCell="0" allowOverlap="1">
             <wp:simplePos x="0" y="0"/>
             <wp:positionH relativeFrom="column">
               <wp:posOffset>57785</wp:posOffset>
@@ -16607,7 +16603,7 @@
       <w:r>
         <w:rPr/>
         <w:drawing>
-          <wp:anchor distT="0" distB="0" distL="0" distR="0" simplePos="0" relativeHeight="45" behindDoc="0" locked="0" layoutInCell="0" allowOverlap="1">
+          <wp:anchor distT="0" distB="0" distL="0" distR="0" simplePos="0" relativeHeight="44" behindDoc="0" locked="0" layoutInCell="0" allowOverlap="1">
             <wp:simplePos x="0" y="0"/>
             <wp:positionH relativeFrom="column">
               <wp:posOffset>3810</wp:posOffset>
@@ -16727,7 +16723,7 @@
       <w:r>
         <w:rPr/>
         <w:drawing>
-          <wp:anchor distT="0" distB="0" distL="0" distR="0" simplePos="0" relativeHeight="46" behindDoc="0" locked="0" layoutInCell="0" allowOverlap="1">
+          <wp:anchor distT="0" distB="0" distL="0" distR="0" simplePos="0" relativeHeight="45" behindDoc="0" locked="0" layoutInCell="0" allowOverlap="1">
             <wp:simplePos x="0" y="0"/>
             <wp:positionH relativeFrom="column">
               <wp:posOffset>14605</wp:posOffset>
@@ -16834,7 +16830,7 @@
       <w:r>
         <w:rPr/>
         <w:drawing>
-          <wp:anchor distT="0" distB="0" distL="0" distR="0" simplePos="0" relativeHeight="47" behindDoc="0" locked="0" layoutInCell="0" allowOverlap="1">
+          <wp:anchor distT="0" distB="0" distL="0" distR="0" simplePos="0" relativeHeight="46" behindDoc="0" locked="0" layoutInCell="0" allowOverlap="1">
             <wp:simplePos x="0" y="0"/>
             <wp:positionH relativeFrom="column">
               <wp:posOffset>36195</wp:posOffset>
@@ -16936,7 +16932,7 @@
       <w:r>
         <w:rPr/>
         <w:drawing>
-          <wp:anchor distT="0" distB="0" distL="0" distR="0" simplePos="0" relativeHeight="48" behindDoc="0" locked="0" layoutInCell="0" allowOverlap="1">
+          <wp:anchor distT="0" distB="0" distL="0" distR="0" simplePos="0" relativeHeight="47" behindDoc="0" locked="0" layoutInCell="0" allowOverlap="1">
             <wp:simplePos x="0" y="0"/>
             <wp:positionH relativeFrom="column">
               <wp:posOffset>-32385</wp:posOffset>
@@ -17333,7 +17329,7 @@
           <w:szCs w:val="20"/>
         </w:rPr>
         <w:drawing>
-          <wp:anchor distT="0" distB="0" distL="0" distR="0" simplePos="0" relativeHeight="98" behindDoc="0" locked="0" layoutInCell="0" allowOverlap="1">
+          <wp:anchor distT="0" distB="0" distL="0" distR="0" simplePos="0" relativeHeight="97" behindDoc="0" locked="0" layoutInCell="0" allowOverlap="1">
             <wp:simplePos x="0" y="0"/>
             <wp:positionH relativeFrom="column">
               <wp:posOffset>6985</wp:posOffset>
@@ -17474,7 +17470,7 @@
           <w:szCs w:val="20"/>
         </w:rPr>
         <w:drawing>
-          <wp:anchor distT="0" distB="0" distL="0" distR="0" simplePos="0" relativeHeight="99" behindDoc="0" locked="0" layoutInCell="0" allowOverlap="1">
+          <wp:anchor distT="0" distB="0" distL="0" distR="0" simplePos="0" relativeHeight="98" behindDoc="0" locked="0" layoutInCell="0" allowOverlap="1">
             <wp:simplePos x="0" y="0"/>
             <wp:positionH relativeFrom="column">
               <wp:posOffset>64770</wp:posOffset>
@@ -17622,7 +17618,7 @@
       <w:r>
         <w:rPr/>
         <w:drawing>
-          <wp:anchor distT="0" distB="0" distL="0" distR="0" simplePos="0" relativeHeight="89" behindDoc="0" locked="0" layoutInCell="0" allowOverlap="1">
+          <wp:anchor distT="0" distB="0" distL="0" distR="0" simplePos="0" relativeHeight="88" behindDoc="0" locked="0" layoutInCell="0" allowOverlap="1">
             <wp:simplePos x="0" y="0"/>
             <wp:positionH relativeFrom="column">
               <wp:posOffset>-32385</wp:posOffset>
@@ -17775,7 +17771,7 @@
       <w:r>
         <w:rPr/>
         <w:drawing>
-          <wp:anchor distT="0" distB="0" distL="0" distR="0" simplePos="0" relativeHeight="90" behindDoc="0" locked="0" layoutInCell="0" allowOverlap="1">
+          <wp:anchor distT="0" distB="0" distL="0" distR="0" simplePos="0" relativeHeight="89" behindDoc="0" locked="0" layoutInCell="0" allowOverlap="1">
             <wp:simplePos x="0" y="0"/>
             <wp:positionH relativeFrom="column">
               <wp:posOffset>17780</wp:posOffset>
@@ -18178,25 +18174,92 @@
         <w:softHyphen/>
         <w:t>mandate reference and a mandate date are avail</w:t>
         <w:softHyphen/>
-        <w:t xml:space="preserve">able. However, if a due date is entered via a member's profile without the mandate reference and mandate date being available, </w:t>
+        <w:t>able.</w:t>
+      </w:r>
+    </w:p>
+    <w:p>
+      <w:pPr>
+        <w:pStyle w:val="Normal"/>
+        <w:bidi w:val="0"/>
+        <w:jc w:val="left"/>
+        <w:rPr>
+          <w:sz w:val="20"/>
+          <w:szCs w:val="20"/>
+        </w:rPr>
+      </w:pPr>
+      <w:r>
+        <w:rPr>
+          <w:sz w:val="20"/>
+          <w:szCs w:val="20"/>
+        </w:rPr>
+      </w:r>
+    </w:p>
+    <w:p>
+      <w:pPr>
+        <w:pStyle w:val="Normal"/>
+        <w:jc w:val="center"/>
+        <w:rPr>
+          <w:b/>
+          <w:bCs/>
+        </w:rPr>
+      </w:pPr>
+      <w:r>
+        <w:rPr>
+          <w:b/>
+          <w:bCs/>
+        </w:rPr>
+        <w:t>Important NOTE</w:t>
+      </w:r>
+    </w:p>
+    <w:p>
+      <w:pPr>
+        <w:pStyle w:val="Normal"/>
+        <w:jc w:val="center"/>
+        <w:rPr>
+          <w:b/>
+          <w:bCs/>
+        </w:rPr>
+      </w:pPr>
+      <w:r>
+        <w:rPr>
+          <w:b/>
+          <w:bCs/>
+        </w:rPr>
+      </w:r>
+    </w:p>
+    <w:p>
+      <w:pPr>
+        <w:pStyle w:val="Normal"/>
+        <w:bidi w:val="0"/>
+        <w:jc w:val="center"/>
+        <w:rPr>
+          <w:i/>
+          <w:iCs/>
+        </w:rPr>
+      </w:pPr>
+      <w:r>
+        <w:rPr>
+          <w:i/>
+          <w:iCs/>
+        </w:rPr>
+        <w:t>The "Due date for all" setting (Preferences &gt; Export &gt; SEPA) allows you to set a due date even when no IBAN or mandate details are available. This enables the use of the #due_day# placeholder in email notifica</w:t>
         <w:softHyphen/>
-        <w:t>malfunctions can occur as the program continues to run.</w:t>
-      </w:r>
-    </w:p>
-    <w:p>
-      <w:pPr>
-        <w:pStyle w:val="Normal"/>
-        <w:bidi w:val="0"/>
-        <w:jc w:val="left"/>
-        <w:rPr>
-          <w:sz w:val="20"/>
-          <w:szCs w:val="20"/>
-        </w:rPr>
-      </w:pPr>
-      <w:r>
-        <w:rPr>
-          <w:sz w:val="20"/>
-          <w:szCs w:val="20"/>
+        <w:t>tions—for example, to send payment requests to members who do not participate in the SEPA Direct Debit scheme.</w:t>
+      </w:r>
+    </w:p>
+    <w:p>
+      <w:pPr>
+        <w:pStyle w:val="Normal"/>
+        <w:jc w:val="center"/>
+        <w:rPr>
+          <w:b/>
+          <w:bCs/>
+        </w:rPr>
+      </w:pPr>
+      <w:r>
+        <w:rPr>
+          <w:b/>
+          <w:bCs/>
         </w:rPr>
       </w:r>
     </w:p>
@@ -18493,6 +18556,126 @@
     </w:p>
     <w:p>
       <w:pPr>
+        <w:pStyle w:val="Normal"/>
+        <w:jc w:val="left"/>
+        <w:rPr>
+          <w:rFonts w:ascii="Arial" w:hAnsi="Arial"/>
+        </w:rPr>
+      </w:pPr>
+      <w:r>
+        <w:rPr/>
+      </w:r>
+    </w:p>
+    <w:p>
+      <w:pPr>
+        <w:pStyle w:val="Normal"/>
+        <w:jc w:val="left"/>
+        <w:rPr>
+          <w:rFonts w:ascii="Arial" w:hAnsi="Arial"/>
+        </w:rPr>
+      </w:pPr>
+      <w:r>
+        <w:rPr/>
+      </w:r>
+    </w:p>
+    <w:p>
+      <w:pPr>
+        <w:pStyle w:val="Normal"/>
+        <w:jc w:val="left"/>
+        <w:rPr>
+          <w:rFonts w:ascii="Arial" w:hAnsi="Arial"/>
+        </w:rPr>
+      </w:pPr>
+      <w:r>
+        <w:rPr/>
+      </w:r>
+    </w:p>
+    <w:p>
+      <w:pPr>
+        <w:pStyle w:val="Normal"/>
+        <w:jc w:val="left"/>
+        <w:rPr>
+          <w:rFonts w:ascii="Arial" w:hAnsi="Arial"/>
+        </w:rPr>
+      </w:pPr>
+      <w:r>
+        <w:rPr/>
+      </w:r>
+    </w:p>
+    <w:p>
+      <w:pPr>
+        <w:pStyle w:val="Normal"/>
+        <w:jc w:val="left"/>
+        <w:rPr>
+          <w:rFonts w:ascii="Arial" w:hAnsi="Arial"/>
+        </w:rPr>
+      </w:pPr>
+      <w:r>
+        <w:rPr/>
+      </w:r>
+    </w:p>
+    <w:p>
+      <w:pPr>
+        <w:pStyle w:val="Normal"/>
+        <w:jc w:val="left"/>
+        <w:rPr>
+          <w:rFonts w:ascii="Arial" w:hAnsi="Arial"/>
+        </w:rPr>
+      </w:pPr>
+      <w:r>
+        <w:rPr/>
+      </w:r>
+    </w:p>
+    <w:p>
+      <w:pPr>
+        <w:pStyle w:val="Normal"/>
+        <w:jc w:val="left"/>
+        <w:rPr>
+          <w:rFonts w:ascii="Arial" w:hAnsi="Arial"/>
+        </w:rPr>
+      </w:pPr>
+      <w:r>
+        <w:rPr/>
+      </w:r>
+    </w:p>
+    <w:p>
+      <w:pPr>
+        <w:pStyle w:val="Normal"/>
+        <w:jc w:val="left"/>
+        <w:rPr>
+          <w:rFonts w:ascii="Arial" w:hAnsi="Arial"/>
+        </w:rPr>
+      </w:pPr>
+      <w:r>
+        <w:rPr/>
+      </w:r>
+    </w:p>
+    <w:p>
+      <w:pPr>
+        <w:pStyle w:val="Normal"/>
+        <w:jc w:val="left"/>
+        <w:rPr>
+          <w:rFonts w:ascii="Arial" w:hAnsi="Arial"/>
+        </w:rPr>
+      </w:pPr>
+      <w:r>
+        <w:rPr/>
+      </w:r>
+    </w:p>
+    <w:p>
+      <w:pPr>
+        <w:pStyle w:val="Normal"/>
+        <w:jc w:val="left"/>
+        <w:rPr>
+          <w:rFonts w:ascii="Arial" w:hAnsi="Arial"/>
+        </w:rPr>
+      </w:pPr>
+      <w:r>
+        <w:rPr/>
+      </w:r>
+    </w:p>
+    <w:p>
+      <w:pPr>
         <w:pStyle w:val="Heading3"/>
         <w:numPr>
           <w:ilvl w:val="2"/>
@@ -18525,7 +18708,7 @@
       <w:r>
         <w:rPr/>
         <w:drawing>
-          <wp:anchor distT="0" distB="0" distL="0" distR="0" simplePos="0" relativeHeight="49" behindDoc="0" locked="0" layoutInCell="0" allowOverlap="1">
+          <wp:anchor distT="0" distB="0" distL="0" distR="0" simplePos="0" relativeHeight="48" behindDoc="0" locked="0" layoutInCell="0" allowOverlap="1">
             <wp:simplePos x="0" y="0"/>
             <wp:positionH relativeFrom="column">
               <wp:posOffset>68580</wp:posOffset>
@@ -18697,7 +18880,7 @@
       <w:r>
         <w:rPr/>
         <w:drawing>
-          <wp:anchor distT="0" distB="0" distL="0" distR="0" simplePos="0" relativeHeight="50" behindDoc="0" locked="0" layoutInCell="0" allowOverlap="1">
+          <wp:anchor distT="0" distB="0" distL="0" distR="0" simplePos="0" relativeHeight="49" behindDoc="0" locked="0" layoutInCell="0" allowOverlap="1">
             <wp:simplePos x="0" y="0"/>
             <wp:positionH relativeFrom="column">
               <wp:posOffset>-17780</wp:posOffset>
@@ -18815,7 +18998,7 @@
       <w:r>
         <w:rPr/>
         <w:drawing>
-          <wp:anchor distT="0" distB="0" distL="0" distR="0" simplePos="0" relativeHeight="51" behindDoc="0" locked="0" layoutInCell="0" allowOverlap="1">
+          <wp:anchor distT="0" distB="0" distL="0" distR="0" simplePos="0" relativeHeight="50" behindDoc="0" locked="0" layoutInCell="0" allowOverlap="1">
             <wp:simplePos x="0" y="0"/>
             <wp:positionH relativeFrom="column">
               <wp:posOffset>10795</wp:posOffset>
@@ -19016,7 +19199,7 @@
           <w:rFonts w:ascii="Arial" w:hAnsi="Arial"/>
         </w:rPr>
         <w:drawing>
-          <wp:anchor distT="0" distB="0" distL="0" distR="0" simplePos="0" relativeHeight="52" behindDoc="0" locked="0" layoutInCell="0" allowOverlap="1">
+          <wp:anchor distT="0" distB="0" distL="0" distR="0" simplePos="0" relativeHeight="51" behindDoc="0" locked="0" layoutInCell="0" allowOverlap="1">
             <wp:simplePos x="0" y="0"/>
             <wp:positionH relativeFrom="column">
               <wp:posOffset>68580</wp:posOffset>
@@ -19166,7 +19349,7 @@
           <w:numId w:val="0"/>
         </w:numPr>
         <w:suppressAutoHyphens w:val="true"/>
-        <w:overflowPunct w:val="false"/>
+        <w:overflowPunct w:val="true"/>
         <w:ind w:hanging="0" w:left="0"/>
         <w:jc w:val="left"/>
         <w:rPr>
@@ -19329,7 +19512,7 @@
       <w:r>
         <w:rPr/>
         <w:drawing>
-          <wp:anchor distT="0" distB="0" distL="0" distR="0" simplePos="0" relativeHeight="53" behindDoc="0" locked="0" layoutInCell="0" allowOverlap="1">
+          <wp:anchor distT="0" distB="0" distL="0" distR="0" simplePos="0" relativeHeight="52" behindDoc="0" locked="0" layoutInCell="0" allowOverlap="1">
             <wp:simplePos x="0" y="0"/>
             <wp:positionH relativeFrom="column">
               <wp:posOffset>46990</wp:posOffset>
@@ -19460,7 +19643,7 @@
       <w:r>
         <w:rPr/>
         <w:drawing>
-          <wp:anchor distT="0" distB="0" distL="0" distR="0" simplePos="0" relativeHeight="54" behindDoc="0" locked="0" layoutInCell="0" allowOverlap="1">
+          <wp:anchor distT="0" distB="0" distL="0" distR="0" simplePos="0" relativeHeight="53" behindDoc="0" locked="0" layoutInCell="0" allowOverlap="1">
             <wp:simplePos x="0" y="0"/>
             <wp:positionH relativeFrom="column">
               <wp:posOffset>17780</wp:posOffset>
@@ -19618,7 +19801,7 @@
       <w:r>
         <w:rPr/>
         <w:drawing>
-          <wp:anchor distT="0" distB="0" distL="0" distR="0" simplePos="0" relativeHeight="55" behindDoc="0" locked="0" layoutInCell="0" allowOverlap="1">
+          <wp:anchor distT="0" distB="0" distL="0" distR="0" simplePos="0" relativeHeight="54" behindDoc="0" locked="0" layoutInCell="0" allowOverlap="1">
             <wp:simplePos x="0" y="0"/>
             <wp:positionH relativeFrom="column">
               <wp:posOffset>6985</wp:posOffset>
@@ -19783,7 +19966,7 @@
           <w:numId w:val="0"/>
         </w:numPr>
         <w:suppressAutoHyphens w:val="true"/>
-        <w:overflowPunct w:val="false"/>
+        <w:overflowPunct w:val="true"/>
         <w:ind w:hanging="0" w:left="0"/>
         <w:jc w:val="left"/>
         <w:rPr>
@@ -19851,7 +20034,7 @@
       <w:r>
         <w:rPr/>
         <w:drawing>
-          <wp:anchor distT="0" distB="0" distL="0" distR="0" simplePos="0" relativeHeight="56" behindDoc="0" locked="0" layoutInCell="0" allowOverlap="1">
+          <wp:anchor distT="0" distB="0" distL="0" distR="0" simplePos="0" relativeHeight="55" behindDoc="0" locked="0" layoutInCell="0" allowOverlap="1">
             <wp:simplePos x="0" y="0"/>
             <wp:positionH relativeFrom="column">
               <wp:posOffset>21590</wp:posOffset>
@@ -19952,7 +20135,7 @@
       <w:r>
         <w:rPr/>
         <w:drawing>
-          <wp:anchor distT="0" distB="0" distL="0" distR="0" simplePos="0" relativeHeight="57" behindDoc="0" locked="0" layoutInCell="0" allowOverlap="1">
+          <wp:anchor distT="0" distB="0" distL="0" distR="0" simplePos="0" relativeHeight="56" behindDoc="0" locked="0" layoutInCell="0" allowOverlap="1">
             <wp:simplePos x="0" y="0"/>
             <wp:positionH relativeFrom="column">
               <wp:posOffset>6985</wp:posOffset>
@@ -20212,7 +20395,7 @@
           <w:numId w:val="3"/>
         </w:numPr>
         <w:suppressAutoHyphens w:val="true"/>
-        <w:overflowPunct w:val="false"/>
+        <w:overflowPunct w:val="true"/>
         <w:jc w:val="center"/>
         <w:rPr>
           <w:i/>
@@ -20420,7 +20603,7 @@
           <w:szCs w:val="20"/>
         </w:rPr>
         <w:drawing>
-          <wp:anchor distT="0" distB="0" distL="0" distR="0" simplePos="0" relativeHeight="58" behindDoc="0" locked="0" layoutInCell="0" allowOverlap="1">
+          <wp:anchor distT="0" distB="0" distL="0" distR="0" simplePos="0" relativeHeight="57" behindDoc="0" locked="0" layoutInCell="0" allowOverlap="1">
             <wp:simplePos x="0" y="0"/>
             <wp:positionH relativeFrom="column">
               <wp:posOffset>3202940</wp:posOffset>
@@ -20483,7 +20666,7 @@
       <w:r>
         <w:rPr/>
         <w:drawing>
-          <wp:anchor distT="0" distB="0" distL="0" distR="0" simplePos="0" relativeHeight="59" behindDoc="0" locked="0" layoutInCell="0" allowOverlap="1">
+          <wp:anchor distT="0" distB="0" distL="0" distR="0" simplePos="0" relativeHeight="58" behindDoc="0" locked="0" layoutInCell="0" allowOverlap="1">
             <wp:simplePos x="0" y="0"/>
             <wp:positionH relativeFrom="column">
               <wp:posOffset>0</wp:posOffset>
@@ -21141,7 +21324,7 @@
       <w:r>
         <w:rPr/>
         <w:drawing>
-          <wp:anchor distT="0" distB="0" distL="0" distR="0" simplePos="0" relativeHeight="95" behindDoc="0" locked="0" layoutInCell="0" allowOverlap="1">
+          <wp:anchor distT="0" distB="0" distL="0" distR="0" simplePos="0" relativeHeight="94" behindDoc="0" locked="0" layoutInCell="0" allowOverlap="1">
             <wp:simplePos x="0" y="0"/>
             <wp:positionH relativeFrom="column">
               <wp:posOffset>3232785</wp:posOffset>
@@ -21200,7 +21383,7 @@
       <w:r>
         <w:rPr/>
         <w:drawing>
-          <wp:anchor distT="0" distB="0" distL="0" distR="0" simplePos="0" relativeHeight="60" behindDoc="0" locked="0" layoutInCell="0" allowOverlap="1">
+          <wp:anchor distT="0" distB="0" distL="0" distR="0" simplePos="0" relativeHeight="59" behindDoc="0" locked="0" layoutInCell="0" allowOverlap="1">
             <wp:simplePos x="0" y="0"/>
             <wp:positionH relativeFrom="column">
               <wp:posOffset>-43180</wp:posOffset>
@@ -21802,7 +21985,7 @@
       <w:r>
         <w:rPr/>
         <w:drawing>
-          <wp:anchor distT="0" distB="0" distL="0" distR="0" simplePos="0" relativeHeight="61" behindDoc="0" locked="0" layoutInCell="0" allowOverlap="1">
+          <wp:anchor distT="0" distB="0" distL="0" distR="0" simplePos="0" relativeHeight="60" behindDoc="0" locked="0" layoutInCell="0" allowOverlap="1">
             <wp:simplePos x="0" y="0"/>
             <wp:positionH relativeFrom="column">
               <wp:posOffset>36195</wp:posOffset>
@@ -21925,7 +22108,7 @@
       <w:r>
         <w:rPr/>
         <w:drawing>
-          <wp:anchor distT="0" distB="0" distL="0" distR="0" simplePos="0" relativeHeight="62" behindDoc="0" locked="0" layoutInCell="0" allowOverlap="1">
+          <wp:anchor distT="0" distB="0" distL="0" distR="0" simplePos="0" relativeHeight="61" behindDoc="0" locked="0" layoutInCell="0" allowOverlap="1">
             <wp:simplePos x="0" y="0"/>
             <wp:positionH relativeFrom="column">
               <wp:posOffset>25400</wp:posOffset>
@@ -22574,7 +22757,7 @@
           <w:numId w:val="0"/>
         </w:numPr>
         <w:suppressAutoHyphens w:val="true"/>
-        <w:overflowPunct w:val="false"/>
+        <w:overflowPunct w:val="true"/>
         <w:bidi w:val="0"/>
         <w:ind w:hanging="0" w:left="0"/>
         <w:jc w:val="both"/>
@@ -22670,7 +22853,7 @@
       <w:r>
         <w:rPr/>
         <w:drawing>
-          <wp:anchor distT="0" distB="0" distL="0" distR="0" simplePos="0" relativeHeight="63" behindDoc="0" locked="0" layoutInCell="0" allowOverlap="1">
+          <wp:anchor distT="0" distB="0" distL="0" distR="0" simplePos="0" relativeHeight="62" behindDoc="0" locked="0" layoutInCell="0" allowOverlap="1">
             <wp:simplePos x="0" y="0"/>
             <wp:positionH relativeFrom="column">
               <wp:posOffset>36195</wp:posOffset>
@@ -22716,7 +22899,7 @@
           </wp:anchor>
         </w:drawing>
         <w:drawing>
-          <wp:anchor distT="0" distB="0" distL="0" distR="0" simplePos="0" relativeHeight="64" behindDoc="0" locked="0" layoutInCell="0" allowOverlap="1">
+          <wp:anchor distT="0" distB="0" distL="0" distR="0" simplePos="0" relativeHeight="63" behindDoc="0" locked="0" layoutInCell="0" allowOverlap="1">
             <wp:simplePos x="0" y="0"/>
             <wp:positionH relativeFrom="column">
               <wp:posOffset>3282950</wp:posOffset>
@@ -23338,7 +23521,7 @@
       </w:pPr>
       <w:r>
         <w:drawing>
-          <wp:anchor distT="0" distB="0" distL="0" distR="0" simplePos="0" relativeHeight="66" behindDoc="0" locked="0" layoutInCell="0" allowOverlap="1">
+          <wp:anchor distT="0" distB="0" distL="0" distR="0" simplePos="0" relativeHeight="65" behindDoc="0" locked="0" layoutInCell="0" allowOverlap="1">
             <wp:simplePos x="0" y="0"/>
             <wp:positionH relativeFrom="column">
               <wp:posOffset>3325495</wp:posOffset>
@@ -23425,7 +23608,7 @@
       <w:r>
         <w:rPr/>
         <w:drawing>
-          <wp:anchor distT="0" distB="0" distL="0" distR="0" simplePos="0" relativeHeight="65" behindDoc="0" locked="0" layoutInCell="0" allowOverlap="1">
+          <wp:anchor distT="0" distB="0" distL="0" distR="0" simplePos="0" relativeHeight="64" behindDoc="0" locked="0" layoutInCell="0" allowOverlap="1">
             <wp:simplePos x="0" y="0"/>
             <wp:positionH relativeFrom="column">
               <wp:posOffset>3810</wp:posOffset>
@@ -23929,7 +24112,7 @@
       <w:r>
         <w:rPr/>
         <w:drawing>
-          <wp:anchor distT="0" distB="0" distL="0" distR="0" simplePos="0" relativeHeight="68" behindDoc="0" locked="0" layoutInCell="0" allowOverlap="1">
+          <wp:anchor distT="0" distB="0" distL="0" distR="0" simplePos="0" relativeHeight="67" behindDoc="0" locked="0" layoutInCell="0" allowOverlap="1">
             <wp:simplePos x="0" y="0"/>
             <wp:positionH relativeFrom="column">
               <wp:posOffset>21590</wp:posOffset>
@@ -24091,7 +24274,7 @@
       <w:r>
         <w:rPr/>
         <w:drawing>
-          <wp:anchor distT="0" distB="0" distL="0" distR="0" simplePos="0" relativeHeight="69" behindDoc="0" locked="0" layoutInCell="0" allowOverlap="1">
+          <wp:anchor distT="0" distB="0" distL="0" distR="0" simplePos="0" relativeHeight="68" behindDoc="0" locked="0" layoutInCell="0" allowOverlap="1">
             <wp:simplePos x="0" y="0"/>
             <wp:positionH relativeFrom="column">
               <wp:posOffset>46990</wp:posOffset>
@@ -24198,7 +24381,7 @@
           <w:numId w:val="0"/>
         </w:numPr>
         <w:suppressAutoHyphens w:val="true"/>
-        <w:overflowPunct w:val="false"/>
+        <w:overflowPunct w:val="true"/>
         <w:ind w:hanging="0" w:left="0"/>
         <w:jc w:val="left"/>
         <w:rPr>
@@ -24256,7 +24439,7 @@
       <w:r>
         <w:rPr/>
         <w:drawing>
-          <wp:anchor distT="0" distB="0" distL="0" distR="0" simplePos="0" relativeHeight="70" behindDoc="0" locked="0" layoutInCell="0" allowOverlap="1">
+          <wp:anchor distT="0" distB="0" distL="0" distR="0" simplePos="0" relativeHeight="69" behindDoc="0" locked="0" layoutInCell="0" allowOverlap="1">
             <wp:simplePos x="0" y="0"/>
             <wp:positionH relativeFrom="column">
               <wp:posOffset>6985</wp:posOffset>
@@ -24385,7 +24568,7 @@
       <w:r>
         <w:rPr/>
         <w:drawing>
-          <wp:anchor distT="0" distB="0" distL="0" distR="0" simplePos="0" relativeHeight="71" behindDoc="0" locked="0" layoutInCell="0" allowOverlap="1">
+          <wp:anchor distT="0" distB="0" distL="0" distR="0" simplePos="0" relativeHeight="70" behindDoc="0" locked="0" layoutInCell="0" allowOverlap="1">
             <wp:simplePos x="0" y="0"/>
             <wp:positionH relativeFrom="column">
               <wp:posOffset>50165</wp:posOffset>
@@ -24487,7 +24670,7 @@
       <w:r>
         <w:rPr/>
         <w:drawing>
-          <wp:anchor distT="0" distB="0" distL="0" distR="0" simplePos="0" relativeHeight="72" behindDoc="0" locked="0" layoutInCell="0" allowOverlap="1">
+          <wp:anchor distT="0" distB="0" distL="0" distR="0" simplePos="0" relativeHeight="71" behindDoc="0" locked="0" layoutInCell="0" allowOverlap="1">
             <wp:simplePos x="0" y="0"/>
             <wp:positionH relativeFrom="column">
               <wp:posOffset>57785</wp:posOffset>
@@ -24617,7 +24800,7 @@
           <w:szCs w:val="20"/>
         </w:rPr>
         <w:drawing>
-          <wp:anchor distT="0" distB="0" distL="0" distR="0" simplePos="0" relativeHeight="73" behindDoc="0" locked="0" layoutInCell="0" allowOverlap="1">
+          <wp:anchor distT="0" distB="0" distL="0" distR="0" simplePos="0" relativeHeight="72" behindDoc="0" locked="0" layoutInCell="0" allowOverlap="1">
             <wp:simplePos x="0" y="0"/>
             <wp:positionH relativeFrom="column">
               <wp:posOffset>75565</wp:posOffset>
@@ -24761,7 +24944,7 @@
       <w:r>
         <w:rPr/>
         <w:drawing>
-          <wp:anchor distT="0" distB="0" distL="0" distR="0" simplePos="0" relativeHeight="74" behindDoc="0" locked="0" layoutInCell="0" allowOverlap="1">
+          <wp:anchor distT="0" distB="0" distL="0" distR="0" simplePos="0" relativeHeight="73" behindDoc="0" locked="0" layoutInCell="0" allowOverlap="1">
             <wp:simplePos x="0" y="0"/>
             <wp:positionH relativeFrom="column">
               <wp:posOffset>158115</wp:posOffset>
@@ -24890,7 +25073,7 @@
           <w:szCs w:val="20"/>
         </w:rPr>
         <w:drawing>
-          <wp:anchor distT="0" distB="0" distL="0" distR="0" simplePos="0" relativeHeight="75" behindDoc="0" locked="0" layoutInCell="0" allowOverlap="1">
+          <wp:anchor distT="0" distB="0" distL="0" distR="0" simplePos="0" relativeHeight="74" behindDoc="0" locked="0" layoutInCell="0" allowOverlap="1">
             <wp:simplePos x="0" y="0"/>
             <wp:positionH relativeFrom="column">
               <wp:posOffset>28575</wp:posOffset>
@@ -24983,7 +25166,7 @@
       <w:r>
         <w:rPr/>
         <w:drawing>
-          <wp:anchor distT="0" distB="0" distL="0" distR="0" simplePos="0" relativeHeight="76" behindDoc="0" locked="0" layoutInCell="0" allowOverlap="1">
+          <wp:anchor distT="0" distB="0" distL="0" distR="0" simplePos="0" relativeHeight="75" behindDoc="0" locked="0" layoutInCell="0" allowOverlap="1">
             <wp:simplePos x="0" y="0"/>
             <wp:positionH relativeFrom="column">
               <wp:posOffset>-28575</wp:posOffset>
@@ -25039,7 +25222,7 @@
           <w:numId w:val="0"/>
         </w:numPr>
         <w:suppressAutoHyphens w:val="true"/>
-        <w:overflowPunct w:val="false"/>
+        <w:overflowPunct w:val="true"/>
         <w:ind w:hanging="0" w:left="0"/>
         <w:jc w:val="left"/>
         <w:rPr>
@@ -25086,7 +25269,7 @@
       <w:r>
         <w:rPr/>
         <w:drawing>
-          <wp:anchor distT="0" distB="0" distL="0" distR="0" simplePos="0" relativeHeight="77" behindDoc="0" locked="0" layoutInCell="0" allowOverlap="1">
+          <wp:anchor distT="0" distB="0" distL="0" distR="0" simplePos="0" relativeHeight="76" behindDoc="0" locked="0" layoutInCell="0" allowOverlap="1">
             <wp:simplePos x="0" y="0"/>
             <wp:positionH relativeFrom="column">
               <wp:posOffset>86360</wp:posOffset>
@@ -25227,7 +25410,7 @@
       <w:r>
         <w:rPr/>
         <w:drawing>
-          <wp:anchor distT="0" distB="0" distL="0" distR="0" simplePos="0" relativeHeight="78" behindDoc="0" locked="0" layoutInCell="0" allowOverlap="1">
+          <wp:anchor distT="0" distB="0" distL="0" distR="0" simplePos="0" relativeHeight="77" behindDoc="0" locked="0" layoutInCell="0" allowOverlap="1">
             <wp:simplePos x="0" y="0"/>
             <wp:positionH relativeFrom="column">
               <wp:posOffset>21590</wp:posOffset>
@@ -25346,7 +25529,7 @@
       <w:r>
         <w:rPr/>
         <w:drawing>
-          <wp:anchor distT="0" distB="0" distL="0" distR="0" simplePos="0" relativeHeight="79" behindDoc="0" locked="0" layoutInCell="0" allowOverlap="1">
+          <wp:anchor distT="0" distB="0" distL="0" distR="0" simplePos="0" relativeHeight="78" behindDoc="0" locked="0" layoutInCell="0" allowOverlap="1">
             <wp:simplePos x="0" y="0"/>
             <wp:positionH relativeFrom="column">
               <wp:posOffset>-16510</wp:posOffset>
@@ -25428,7 +25611,7 @@
           <w:numId w:val="0"/>
         </w:numPr>
         <w:suppressAutoHyphens w:val="true"/>
-        <w:overflowPunct w:val="false"/>
+        <w:overflowPunct w:val="true"/>
         <w:ind w:hanging="0" w:left="0"/>
         <w:jc w:val="left"/>
         <w:rPr>
@@ -25475,7 +25658,7 @@
       <w:r>
         <w:rPr/>
         <w:drawing>
-          <wp:anchor distT="0" distB="0" distL="0" distR="0" simplePos="0" relativeHeight="80" behindDoc="0" locked="0" layoutInCell="0" allowOverlap="1">
+          <wp:anchor distT="0" distB="0" distL="0" distR="0" simplePos="0" relativeHeight="79" behindDoc="0" locked="0" layoutInCell="0" allowOverlap="1">
             <wp:simplePos x="0" y="0"/>
             <wp:positionH relativeFrom="column">
               <wp:posOffset>57785</wp:posOffset>
@@ -25670,7 +25853,7 @@
       <w:r>
         <w:rPr/>
         <w:drawing>
-          <wp:anchor distT="0" distB="0" distL="0" distR="0" simplePos="0" relativeHeight="81" behindDoc="0" locked="0" layoutInCell="0" allowOverlap="1">
+          <wp:anchor distT="0" distB="0" distL="0" distR="0" simplePos="0" relativeHeight="80" behindDoc="0" locked="0" layoutInCell="0" allowOverlap="1">
             <wp:simplePos x="0" y="0"/>
             <wp:positionH relativeFrom="column">
               <wp:posOffset>-17780</wp:posOffset>
@@ -25791,7 +25974,7 @@
       <w:r>
         <w:rPr/>
         <w:drawing>
-          <wp:anchor distT="0" distB="0" distL="0" distR="0" simplePos="0" relativeHeight="82" behindDoc="0" locked="0" layoutInCell="0" allowOverlap="1">
+          <wp:anchor distT="0" distB="0" distL="0" distR="0" simplePos="0" relativeHeight="81" behindDoc="0" locked="0" layoutInCell="0" allowOverlap="1">
             <wp:simplePos x="0" y="0"/>
             <wp:positionH relativeFrom="column">
               <wp:posOffset>-10795</wp:posOffset>
@@ -25880,7 +26063,7 @@
       <w:r>
         <w:rPr/>
         <w:drawing>
-          <wp:anchor distT="0" distB="0" distL="0" distR="0" simplePos="0" relativeHeight="83" behindDoc="0" locked="0" layoutInCell="0" allowOverlap="1">
+          <wp:anchor distT="0" distB="0" distL="0" distR="0" simplePos="0" relativeHeight="82" behindDoc="0" locked="0" layoutInCell="0" allowOverlap="1">
             <wp:simplePos x="0" y="0"/>
             <wp:positionH relativeFrom="column">
               <wp:posOffset>-10160</wp:posOffset>
@@ -25996,7 +26179,7 @@
           <w:numId w:val="0"/>
         </w:numPr>
         <w:suppressAutoHyphens w:val="true"/>
-        <w:overflowPunct w:val="false"/>
+        <w:overflowPunct w:val="true"/>
         <w:ind w:hanging="0" w:left="0"/>
         <w:jc w:val="left"/>
         <w:rPr>
@@ -26980,7 +27163,7 @@
       </w:pPr>
       <w:r>
         <w:drawing>
-          <wp:anchor distT="0" distB="0" distL="0" distR="0" simplePos="0" relativeHeight="84" behindDoc="0" locked="0" layoutInCell="0" allowOverlap="1">
+          <wp:anchor distT="0" distB="0" distL="0" distR="0" simplePos="0" relativeHeight="83" behindDoc="0" locked="0" layoutInCell="0" allowOverlap="1">
             <wp:simplePos x="0" y="0"/>
             <wp:positionH relativeFrom="column">
               <wp:posOffset>35560</wp:posOffset>
@@ -27026,7 +27209,7 @@
           </wp:anchor>
         </w:drawing>
         <w:drawing>
-          <wp:anchor distT="0" distB="0" distL="0" distR="0" simplePos="0" relativeHeight="85" behindDoc="0" locked="0" layoutInCell="0" allowOverlap="1">
+          <wp:anchor distT="0" distB="0" distL="0" distR="0" simplePos="0" relativeHeight="84" behindDoc="0" locked="0" layoutInCell="0" allowOverlap="1">
             <wp:simplePos x="0" y="0"/>
             <wp:positionH relativeFrom="column">
               <wp:posOffset>34290</wp:posOffset>
@@ -27191,7 +27374,7 @@
           <w:szCs w:val="20"/>
         </w:rPr>
         <w:drawing>
-          <wp:anchor distT="0" distB="0" distL="0" distR="0" simplePos="0" relativeHeight="86" behindDoc="0" locked="0" layoutInCell="0" allowOverlap="1">
+          <wp:anchor distT="0" distB="0" distL="0" distR="0" simplePos="0" relativeHeight="85" behindDoc="0" locked="0" layoutInCell="0" allowOverlap="1">
             <wp:simplePos x="0" y="0"/>
             <wp:positionH relativeFrom="column">
               <wp:posOffset>32385</wp:posOffset>
@@ -27297,7 +27480,7 @@
       <w:r>
         <w:rPr/>
         <w:drawing>
-          <wp:anchor distT="0" distB="0" distL="0" distR="0" simplePos="0" relativeHeight="87" behindDoc="0" locked="0" layoutInCell="0" allowOverlap="1">
+          <wp:anchor distT="0" distB="0" distL="0" distR="0" simplePos="0" relativeHeight="86" behindDoc="0" locked="0" layoutInCell="0" allowOverlap="1">
             <wp:simplePos x="0" y="0"/>
             <wp:positionH relativeFrom="column">
               <wp:posOffset>45085</wp:posOffset>
@@ -27387,7 +27570,7 @@
       <w:r>
         <w:rPr/>
         <w:drawing>
-          <wp:anchor distT="0" distB="0" distL="0" distR="0" simplePos="0" relativeHeight="88" behindDoc="0" locked="0" layoutInCell="0" allowOverlap="1">
+          <wp:anchor distT="0" distB="0" distL="0" distR="0" simplePos="0" relativeHeight="87" behindDoc="0" locked="0" layoutInCell="0" allowOverlap="1">
             <wp:simplePos x="0" y="0"/>
             <wp:positionH relativeFrom="column">
               <wp:posOffset>75565</wp:posOffset>
@@ -27529,7 +27712,7 @@
       <w:r>
         <w:rPr/>
         <w:drawing>
-          <wp:anchor distT="0" distB="0" distL="0" distR="0" simplePos="0" relativeHeight="101" behindDoc="0" locked="0" layoutInCell="0" allowOverlap="1">
+          <wp:anchor distT="0" distB="0" distL="0" distR="0" simplePos="0" relativeHeight="100" behindDoc="0" locked="0" layoutInCell="0" allowOverlap="1">
             <wp:simplePos x="0" y="0"/>
             <wp:positionH relativeFrom="column">
               <wp:posOffset>125730</wp:posOffset>
@@ -27585,7 +27768,7 @@
           <w:numId w:val="0"/>
         </w:numPr>
         <w:suppressAutoHyphens w:val="true"/>
-        <w:overflowPunct w:val="false"/>
+        <w:overflowPunct w:val="true"/>
         <w:ind w:hanging="0" w:left="0"/>
         <w:jc w:val="left"/>
         <w:rPr>
@@ -27674,7 +27857,7 @@
       <w:r>
         <w:rPr/>
         <w:drawing>
-          <wp:anchor distT="0" distB="0" distL="0" distR="0" simplePos="0" relativeHeight="91" behindDoc="0" locked="0" layoutInCell="0" allowOverlap="1">
+          <wp:anchor distT="0" distB="0" distL="0" distR="0" simplePos="0" relativeHeight="90" behindDoc="0" locked="0" layoutInCell="0" allowOverlap="1">
             <wp:simplePos x="0" y="0"/>
             <wp:positionH relativeFrom="column">
               <wp:posOffset>28575</wp:posOffset>
@@ -27842,7 +28025,7 @@
       <w:r>
         <w:rPr/>
         <w:drawing>
-          <wp:anchor distT="0" distB="0" distL="0" distR="0" simplePos="0" relativeHeight="67" behindDoc="0" locked="0" layoutInCell="0" allowOverlap="1">
+          <wp:anchor distT="0" distB="0" distL="0" distR="0" simplePos="0" relativeHeight="66" behindDoc="0" locked="0" layoutInCell="0" allowOverlap="1">
             <wp:simplePos x="0" y="0"/>
             <wp:positionH relativeFrom="column">
               <wp:posOffset>90170</wp:posOffset>
@@ -27938,7 +28121,7 @@
           <w:numId w:val="0"/>
         </w:numPr>
         <w:suppressAutoHyphens w:val="true"/>
-        <w:overflowPunct w:val="false"/>
+        <w:overflowPunct w:val="true"/>
         <w:ind w:hanging="0" w:left="0"/>
         <w:jc w:val="left"/>
         <w:rPr>
@@ -28388,7 +28571,7 @@
       <w:r>
         <w:rPr/>
         <w:drawing>
-          <wp:anchor distT="0" distB="0" distL="0" distR="0" simplePos="0" relativeHeight="106" behindDoc="0" locked="0" layoutInCell="0" allowOverlap="1">
+          <wp:anchor distT="0" distB="0" distL="0" distR="0" simplePos="0" relativeHeight="105" behindDoc="0" locked="0" layoutInCell="0" allowOverlap="1">
             <wp:simplePos x="0" y="0"/>
             <wp:positionH relativeFrom="column">
               <wp:posOffset>-74295</wp:posOffset>
@@ -29321,7 +29504,7 @@
           <w:numId w:val="0"/>
         </w:numPr>
         <w:suppressAutoHyphens w:val="true"/>
-        <w:overflowPunct w:val="false"/>
+        <w:overflowPunct w:val="true"/>
         <w:ind w:hanging="0" w:left="0"/>
         <w:jc w:val="left"/>
         <w:rPr>
@@ -29368,7 +29551,7 @@
       <w:r>
         <w:rPr/>
         <w:drawing>
-          <wp:anchor distT="0" distB="0" distL="0" distR="0" simplePos="0" relativeHeight="93" behindDoc="0" locked="0" layoutInCell="0" allowOverlap="1">
+          <wp:anchor distT="0" distB="0" distL="0" distR="0" simplePos="0" relativeHeight="92" behindDoc="0" locked="0" layoutInCell="0" allowOverlap="1">
             <wp:simplePos x="0" y="0"/>
             <wp:positionH relativeFrom="column">
               <wp:posOffset>39370</wp:posOffset>
@@ -30713,15 +30896,15 @@
       <w:r>
         <w:rPr/>
         <w:drawing>
-          <wp:anchor distT="0" distB="0" distL="0" distR="0" simplePos="0" relativeHeight="25" behindDoc="0" locked="0" layoutInCell="0" allowOverlap="1">
+          <wp:anchor distT="0" distB="0" distL="0" distR="0" simplePos="0" relativeHeight="107" behindDoc="0" locked="0" layoutInCell="0" allowOverlap="1">
             <wp:simplePos x="0" y="0"/>
             <wp:positionH relativeFrom="column">
               <wp:posOffset>46990</wp:posOffset>
             </wp:positionH>
             <wp:positionV relativeFrom="paragraph">
-              <wp:posOffset>71755</wp:posOffset>
+              <wp:posOffset>69850</wp:posOffset>
             </wp:positionV>
-            <wp:extent cx="3239770" cy="2707005"/>
+            <wp:extent cx="3239770" cy="3743325"/>
             <wp:effectExtent l="0" t="0" r="0" b="0"/>
             <wp:wrapTopAndBottom/>
             <wp:docPr id="91" name="Bild91"/>
@@ -30746,7 +30929,7 @@
                   <pic:spPr bwMode="auto">
                     <a:xfrm>
                       <a:off x="0" y="0"/>
-                      <a:ext cx="3239770" cy="2707005"/>
+                      <a:ext cx="3239770" cy="3743325"/>
                     </a:xfrm>
                     <a:prstGeom prst="rect">
                       <a:avLst/>
@@ -30806,31 +30989,6 @@
     <w:p>
       <w:pPr>
         <w:pStyle w:val="Heading2"/>
-        <w:widowControl/>
-        <w:numPr>
-          <w:ilvl w:val="0"/>
-          <w:numId w:val="0"/>
-        </w:numPr>
-        <w:suppressAutoHyphens w:val="true"/>
-        <w:overflowPunct w:val="false"/>
-        <w:ind w:hanging="0" w:left="0"/>
-        <w:jc w:val="left"/>
-        <w:rPr>
-          <w:rFonts w:ascii="Arial" w:hAnsi="Arial"/>
-        </w:rPr>
-      </w:pPr>
-      <w:r>
-        <w:rPr>
-          <w:rFonts w:ascii="Arial" w:hAnsi="Arial"/>
-        </w:rPr>
-      </w:r>
-      <w:r>
-        <w:br w:type="page"/>
-      </w:r>
-    </w:p>
-    <w:p>
-      <w:pPr>
-        <w:pStyle w:val="Heading2"/>
         <w:numPr>
           <w:ilvl w:val="1"/>
           <w:numId w:val="3"/>
@@ -30872,7 +31030,7 @@
       <w:r>
         <w:rPr/>
         <w:drawing>
-          <wp:anchor distT="0" distB="0" distL="0" distR="0" simplePos="0" relativeHeight="26" behindDoc="0" locked="0" layoutInCell="0" allowOverlap="1">
+          <wp:anchor distT="0" distB="0" distL="0" distR="0" simplePos="0" relativeHeight="25" behindDoc="0" locked="0" layoutInCell="0" allowOverlap="1">
             <wp:simplePos x="0" y="0"/>
             <wp:positionH relativeFrom="column">
               <wp:posOffset>3810</wp:posOffset>
@@ -30944,7 +31102,7 @@
       <w:r>
         <w:rPr/>
         <w:drawing>
-          <wp:anchor distT="0" distB="0" distL="0" distR="0" simplePos="0" relativeHeight="27" behindDoc="0" locked="0" layoutInCell="0" allowOverlap="1">
+          <wp:anchor distT="0" distB="0" distL="0" distR="0" simplePos="0" relativeHeight="26" behindDoc="0" locked="0" layoutInCell="0" allowOverlap="1">
             <wp:simplePos x="0" y="0"/>
             <wp:positionH relativeFrom="column">
               <wp:posOffset>17780</wp:posOffset>
@@ -31054,7 +31212,7 @@
           <w:szCs w:val="20"/>
         </w:rPr>
         <w:drawing>
-          <wp:anchor distT="0" distB="0" distL="0" distR="0" simplePos="0" relativeHeight="28" behindDoc="0" locked="0" layoutInCell="0" allowOverlap="1">
+          <wp:anchor distT="0" distB="0" distL="0" distR="0" simplePos="0" relativeHeight="27" behindDoc="0" locked="0" layoutInCell="0" allowOverlap="1">
             <wp:simplePos x="0" y="0"/>
             <wp:positionH relativeFrom="column">
               <wp:posOffset>64770</wp:posOffset>
@@ -31174,7 +31332,7 @@
       <w:r>
         <w:rPr/>
         <w:drawing>
-          <wp:anchor distT="0" distB="0" distL="0" distR="0" simplePos="0" relativeHeight="96" behindDoc="0" locked="0" layoutInCell="0" allowOverlap="1">
+          <wp:anchor distT="0" distB="0" distL="0" distR="0" simplePos="0" relativeHeight="95" behindDoc="0" locked="0" layoutInCell="0" allowOverlap="1">
             <wp:simplePos x="0" y="0"/>
             <wp:positionH relativeFrom="column">
               <wp:posOffset>123825</wp:posOffset>
@@ -31220,7 +31378,7 @@
           </wp:anchor>
         </w:drawing>
         <w:drawing>
-          <wp:anchor distT="0" distB="0" distL="0" distR="0" simplePos="0" relativeHeight="97" behindDoc="0" locked="0" layoutInCell="0" allowOverlap="1">
+          <wp:anchor distT="0" distB="0" distL="0" distR="0" simplePos="0" relativeHeight="96" behindDoc="0" locked="0" layoutInCell="0" allowOverlap="1">
             <wp:simplePos x="0" y="0"/>
             <wp:positionH relativeFrom="column">
               <wp:posOffset>125730</wp:posOffset>
@@ -31339,7 +31497,7 @@
           <w:szCs w:val="20"/>
         </w:rPr>
         <w:drawing>
-          <wp:anchor distT="0" distB="0" distL="0" distR="0" simplePos="0" relativeHeight="29" behindDoc="0" locked="0" layoutInCell="0" allowOverlap="1">
+          <wp:anchor distT="0" distB="0" distL="0" distR="0" simplePos="0" relativeHeight="28" behindDoc="0" locked="0" layoutInCell="0" allowOverlap="1">
             <wp:simplePos x="0" y="0"/>
             <wp:positionH relativeFrom="column">
               <wp:posOffset>68580</wp:posOffset>
@@ -31489,7 +31647,7 @@
       <w:r>
         <w:rPr/>
         <w:drawing>
-          <wp:anchor distT="0" distB="0" distL="0" distR="0" simplePos="0" relativeHeight="30" behindDoc="0" locked="0" layoutInCell="0" allowOverlap="1">
+          <wp:anchor distT="0" distB="0" distL="0" distR="0" simplePos="0" relativeHeight="29" behindDoc="0" locked="0" layoutInCell="0" allowOverlap="1">
             <wp:simplePos x="0" y="0"/>
             <wp:positionH relativeFrom="column">
               <wp:posOffset>0</wp:posOffset>
@@ -31876,7 +32034,7 @@
       <w:r>
         <w:rPr/>
         <w:drawing>
-          <wp:anchor distT="0" distB="0" distL="0" distR="0" simplePos="0" relativeHeight="31" behindDoc="0" locked="0" layoutInCell="0" allowOverlap="1">
+          <wp:anchor distT="0" distB="0" distL="0" distR="0" simplePos="0" relativeHeight="30" behindDoc="0" locked="0" layoutInCell="0" allowOverlap="1">
             <wp:simplePos x="0" y="0"/>
             <wp:positionH relativeFrom="column">
               <wp:posOffset>-17780</wp:posOffset>
@@ -32981,7 +33139,7 @@
           </w:tcPr>
           <w:p>
             <w:pPr>
-              <w:pStyle w:val="Tabelleninhalt"/>
+              <w:pStyle w:val="Tabelleninhaltuser"/>
               <w:widowControl w:val="false"/>
               <w:jc w:val="left"/>
               <w:rPr>
@@ -33068,7 +33226,7 @@
           </w:tcPr>
           <w:p>
             <w:pPr>
-              <w:pStyle w:val="Tabelleninhalt"/>
+              <w:pStyle w:val="Tabelleninhaltuser"/>
               <w:widowControl w:val="false"/>
               <w:jc w:val="left"/>
               <w:rPr>
@@ -33155,7 +33313,7 @@
           </w:tcPr>
           <w:p>
             <w:pPr>
-              <w:pStyle w:val="Tabelleninhalt"/>
+              <w:pStyle w:val="Tabelleninhaltuser"/>
               <w:widowControl w:val="false"/>
               <w:jc w:val="left"/>
               <w:rPr>
@@ -33242,7 +33400,7 @@
           </w:tcPr>
           <w:p>
             <w:pPr>
-              <w:pStyle w:val="Tabelleninhalt"/>
+              <w:pStyle w:val="Tabelleninhaltuser"/>
               <w:widowControl w:val="false"/>
               <w:jc w:val="left"/>
               <w:rPr>
@@ -33329,7 +33487,7 @@
           </w:tcPr>
           <w:p>
             <w:pPr>
-              <w:pStyle w:val="Tabelleninhalt"/>
+              <w:pStyle w:val="Tabelleninhaltuser"/>
               <w:widowControl w:val="false"/>
               <w:jc w:val="left"/>
               <w:rPr>
@@ -33416,7 +33574,7 @@
           </w:tcPr>
           <w:p>
             <w:pPr>
-              <w:pStyle w:val="Tabelleninhalt"/>
+              <w:pStyle w:val="Tabelleninhaltuser"/>
               <w:widowControl w:val="false"/>
               <w:jc w:val="left"/>
               <w:rPr>
@@ -33503,7 +33661,7 @@
           </w:tcPr>
           <w:p>
             <w:pPr>
-              <w:pStyle w:val="Tabelleninhalt"/>
+              <w:pStyle w:val="Tabelleninhaltuser"/>
               <w:widowControl w:val="false"/>
               <w:jc w:val="left"/>
               <w:rPr>
@@ -33590,7 +33748,7 @@
           </w:tcPr>
           <w:p>
             <w:pPr>
-              <w:pStyle w:val="Tabelleninhalt"/>
+              <w:pStyle w:val="Tabelleninhaltuser"/>
               <w:widowControl w:val="false"/>
               <w:jc w:val="left"/>
               <w:rPr>
@@ -33677,7 +33835,7 @@
           </w:tcPr>
           <w:p>
             <w:pPr>
-              <w:pStyle w:val="Tabelleninhalt"/>
+              <w:pStyle w:val="Tabelleninhaltuser"/>
               <w:widowControl w:val="false"/>
               <w:jc w:val="left"/>
               <w:rPr>
@@ -33764,7 +33922,7 @@
           </w:tcPr>
           <w:p>
             <w:pPr>
-              <w:pStyle w:val="Tabelleninhalt"/>
+              <w:pStyle w:val="Tabelleninhaltuser"/>
               <w:widowControl w:val="false"/>
               <w:jc w:val="left"/>
               <w:rPr>
@@ -33851,7 +34009,7 @@
           </w:tcPr>
           <w:p>
             <w:pPr>
-              <w:pStyle w:val="Tabelleninhalt"/>
+              <w:pStyle w:val="Tabelleninhaltuser"/>
               <w:widowControl w:val="false"/>
               <w:jc w:val="left"/>
               <w:rPr>
@@ -33938,7 +34096,7 @@
           </w:tcPr>
           <w:p>
             <w:pPr>
-              <w:pStyle w:val="Tabelleninhalt"/>
+              <w:pStyle w:val="Tabelleninhaltuser"/>
               <w:widowControl w:val="false"/>
               <w:jc w:val="left"/>
               <w:rPr>
@@ -34025,7 +34183,7 @@
           </w:tcPr>
           <w:p>
             <w:pPr>
-              <w:pStyle w:val="Tabelleninhalt"/>
+              <w:pStyle w:val="Tabelleninhaltuser"/>
               <w:widowControl w:val="false"/>
               <w:jc w:val="left"/>
               <w:rPr>
@@ -34112,7 +34270,7 @@
           </w:tcPr>
           <w:p>
             <w:pPr>
-              <w:pStyle w:val="Tabelleninhalt"/>
+              <w:pStyle w:val="Tabelleninhaltuser"/>
               <w:widowControl w:val="false"/>
               <w:jc w:val="left"/>
               <w:rPr>
@@ -34199,7 +34357,7 @@
           </w:tcPr>
           <w:p>
             <w:pPr>
-              <w:pStyle w:val="Tabelleninhalt"/>
+              <w:pStyle w:val="Tabelleninhaltuser"/>
               <w:widowControl w:val="false"/>
               <w:jc w:val="left"/>
               <w:rPr>
@@ -34286,7 +34444,7 @@
           </w:tcPr>
           <w:p>
             <w:pPr>
-              <w:pStyle w:val="Tabelleninhalt"/>
+              <w:pStyle w:val="Tabelleninhaltuser"/>
               <w:widowControl w:val="false"/>
               <w:jc w:val="left"/>
               <w:rPr>
@@ -34373,7 +34531,7 @@
           </w:tcPr>
           <w:p>
             <w:pPr>
-              <w:pStyle w:val="Tabelleninhalt"/>
+              <w:pStyle w:val="Tabelleninhaltuser"/>
               <w:widowControl w:val="false"/>
               <w:jc w:val="left"/>
               <w:rPr>
@@ -34460,7 +34618,7 @@
           </w:tcPr>
           <w:p>
             <w:pPr>
-              <w:pStyle w:val="Tabelleninhalt"/>
+              <w:pStyle w:val="Tabelleninhaltuser"/>
               <w:widowControl w:val="false"/>
               <w:jc w:val="left"/>
               <w:rPr>
@@ -34547,7 +34705,7 @@
           </w:tcPr>
           <w:p>
             <w:pPr>
-              <w:pStyle w:val="Tabelleninhalt"/>
+              <w:pStyle w:val="Tabelleninhaltuser"/>
               <w:widowControl w:val="false"/>
               <w:jc w:val="left"/>
               <w:rPr>
@@ -34634,7 +34792,7 @@
           </w:tcPr>
           <w:p>
             <w:pPr>
-              <w:pStyle w:val="Tabelleninhalt"/>
+              <w:pStyle w:val="Tabelleninhaltuser"/>
               <w:widowControl w:val="false"/>
               <w:jc w:val="left"/>
               <w:rPr>
@@ -34721,7 +34879,7 @@
           </w:tcPr>
           <w:p>
             <w:pPr>
-              <w:pStyle w:val="Tabelleninhalt"/>
+              <w:pStyle w:val="Tabelleninhaltuser"/>
               <w:widowControl w:val="false"/>
               <w:jc w:val="left"/>
               <w:rPr>
@@ -34808,7 +34966,7 @@
           </w:tcPr>
           <w:p>
             <w:pPr>
-              <w:pStyle w:val="Tabelleninhalt"/>
+              <w:pStyle w:val="Tabelleninhaltuser"/>
               <w:widowControl w:val="false"/>
               <w:jc w:val="left"/>
               <w:rPr>
@@ -34895,7 +35053,7 @@
           </w:tcPr>
           <w:p>
             <w:pPr>
-              <w:pStyle w:val="Tabelleninhalt"/>
+              <w:pStyle w:val="Tabelleninhaltuser"/>
               <w:widowControl w:val="false"/>
               <w:jc w:val="left"/>
               <w:rPr>
@@ -34982,7 +35140,7 @@
           </w:tcPr>
           <w:p>
             <w:pPr>
-              <w:pStyle w:val="Tabelleninhalt"/>
+              <w:pStyle w:val="Tabelleninhaltuser"/>
               <w:widowControl w:val="false"/>
               <w:jc w:val="left"/>
               <w:rPr>
@@ -35482,7 +35640,7 @@
           <w:numId w:val="0"/>
         </w:numPr>
         <w:suppressAutoHyphens w:val="true"/>
-        <w:overflowPunct w:val="false"/>
+        <w:overflowPunct w:val="true"/>
         <w:ind w:hanging="0" w:left="0"/>
         <w:jc w:val="left"/>
         <w:rPr>
@@ -35538,7 +35696,7 @@
       <w:r>
         <w:rPr/>
         <w:drawing>
-          <wp:anchor distT="0" distB="0" distL="0" distR="0" simplePos="0" relativeHeight="32" behindDoc="0" locked="0" layoutInCell="0" allowOverlap="1">
+          <wp:anchor distT="0" distB="0" distL="0" distR="0" simplePos="0" relativeHeight="31" behindDoc="0" locked="0" layoutInCell="0" allowOverlap="1">
             <wp:simplePos x="0" y="0"/>
             <wp:positionH relativeFrom="column">
               <wp:posOffset>60960</wp:posOffset>
@@ -35670,7 +35828,7 @@
       <w:r>
         <w:rPr/>
         <w:drawing>
-          <wp:anchor distT="0" distB="0" distL="0" distR="0" simplePos="0" relativeHeight="104" behindDoc="0" locked="0" layoutInCell="0" allowOverlap="1">
+          <wp:anchor distT="0" distB="0" distL="0" distR="0" simplePos="0" relativeHeight="103" behindDoc="0" locked="0" layoutInCell="0" allowOverlap="1">
             <wp:simplePos x="0" y="0"/>
             <wp:positionH relativeFrom="column">
               <wp:posOffset>-3810</wp:posOffset>
@@ -35781,7 +35939,7 @@
       <w:r>
         <w:rPr/>
         <w:drawing>
-          <wp:anchor distT="0" distB="0" distL="0" distR="0" simplePos="0" relativeHeight="105" behindDoc="0" locked="0" layoutInCell="0" allowOverlap="1">
+          <wp:anchor distT="0" distB="0" distL="0" distR="0" simplePos="0" relativeHeight="104" behindDoc="0" locked="0" layoutInCell="0" allowOverlap="1">
             <wp:simplePos x="0" y="0"/>
             <wp:positionH relativeFrom="column">
               <wp:posOffset>161925</wp:posOffset>
@@ -35930,7 +36088,7 @@
       <w:r>
         <w:rPr/>
         <w:drawing>
-          <wp:anchor distT="0" distB="0" distL="0" distR="0" simplePos="0" relativeHeight="33" behindDoc="0" locked="0" layoutInCell="0" allowOverlap="1">
+          <wp:anchor distT="0" distB="0" distL="0" distR="0" simplePos="0" relativeHeight="32" behindDoc="0" locked="0" layoutInCell="0" allowOverlap="1">
             <wp:simplePos x="0" y="0"/>
             <wp:positionH relativeFrom="column">
               <wp:posOffset>46990</wp:posOffset>
@@ -36265,7 +36423,7 @@
       <w:r>
         <w:rPr/>
         <w:drawing>
-          <wp:anchor distT="0" distB="0" distL="0" distR="0" simplePos="0" relativeHeight="100" behindDoc="0" locked="0" layoutInCell="0" allowOverlap="1">
+          <wp:anchor distT="0" distB="0" distL="0" distR="0" simplePos="0" relativeHeight="99" behindDoc="0" locked="0" layoutInCell="0" allowOverlap="1">
             <wp:simplePos x="0" y="0"/>
             <wp:positionH relativeFrom="column">
               <wp:posOffset>-22860</wp:posOffset>
@@ -37000,7 +37158,7 @@
           <w:szCs w:val="20"/>
         </w:rPr>
         <w:drawing>
-          <wp:anchor distT="0" distB="0" distL="0" distR="0" simplePos="0" relativeHeight="102" behindDoc="0" locked="0" layoutInCell="0" allowOverlap="1">
+          <wp:anchor distT="0" distB="0" distL="0" distR="0" simplePos="0" relativeHeight="101" behindDoc="0" locked="0" layoutInCell="0" allowOverlap="1">
             <wp:simplePos x="0" y="0"/>
             <wp:positionH relativeFrom="column">
               <wp:posOffset>0</wp:posOffset>
@@ -37152,7 +37310,7 @@
           <w:szCs w:val="20"/>
         </w:rPr>
         <w:drawing>
-          <wp:anchor distT="0" distB="0" distL="0" distR="0" simplePos="0" relativeHeight="103" behindDoc="0" locked="0" layoutInCell="0" allowOverlap="1">
+          <wp:anchor distT="0" distB="0" distL="0" distR="0" simplePos="0" relativeHeight="102" behindDoc="0" locked="0" layoutInCell="0" allowOverlap="1">
             <wp:simplePos x="0" y="0"/>
             <wp:positionH relativeFrom="column">
               <wp:posOffset>40640</wp:posOffset>
@@ -38409,7 +38567,7 @@
     </w:r>
     <w:r>
       <w:rPr/>
-      <w:t>60</w:t>
+      <w:t>62</w:t>
     </w:r>
     <w:r>
       <w:rPr/>
@@ -42770,7 +42928,7 @@
     <w:pPr>
       <w:widowControl/>
       <w:suppressAutoHyphens w:val="true"/>
-      <w:overflowPunct w:val="false"/>
+      <w:overflowPunct w:val="true"/>
       <w:bidi w:val="0"/>
       <w:spacing w:before="0" w:after="0"/>
       <w:jc w:val="left"/>
@@ -42786,7 +42944,7 @@
   </w:style>
   <w:style w:type="paragraph" w:styleId="Heading1">
     <w:name w:val="heading 1"/>
-    <w:basedOn w:val="berschrift"/>
+    <w:basedOn w:val="berschriftuser"/>
     <w:next w:val="BodyText"/>
     <w:qFormat/>
     <w:pPr>
@@ -42802,7 +42960,7 @@
   </w:style>
   <w:style w:type="paragraph" w:styleId="Heading2">
     <w:name w:val="heading 2"/>
-    <w:basedOn w:val="berschrift"/>
+    <w:basedOn w:val="berschriftuser"/>
     <w:next w:val="BodyText"/>
     <w:qFormat/>
     <w:pPr>
@@ -42818,7 +42976,7 @@
   </w:style>
   <w:style w:type="paragraph" w:styleId="Heading3">
     <w:name w:val="heading 3"/>
-    <w:basedOn w:val="berschrift"/>
+    <w:basedOn w:val="berschriftuser"/>
     <w:next w:val="BodyText"/>
     <w:qFormat/>
     <w:pPr>
@@ -42834,7 +42992,7 @@
   </w:style>
   <w:style w:type="paragraph" w:styleId="Heading4">
     <w:name w:val="heading 4"/>
-    <w:basedOn w:val="berschrift"/>
+    <w:basedOn w:val="berschriftuser"/>
     <w:next w:val="BodyText"/>
     <w:qFormat/>
     <w:pPr>
@@ -42850,8 +43008,8 @@
       <w:szCs w:val="26"/>
     </w:rPr>
   </w:style>
-  <w:style w:type="character" w:styleId="Aufzhlungszeichen">
-    <w:name w:val="Aufzählungszeichen"/>
+  <w:style w:type="character" w:styleId="Aufzhlungszeichenuser">
+    <w:name w:val="Aufzählungszeichen (user)"/>
     <w:qFormat/>
     <w:rPr>
       <w:rFonts w:ascii="OpenSymbol" w:hAnsi="OpenSymbol" w:eastAsia="OpenSymbol" w:cs="OpenSymbol"/>
@@ -42866,13 +43024,13 @@
       <w:lang w:val="en-US" w:eastAsia="zxx" w:bidi="zxx"/>
     </w:rPr>
   </w:style>
-  <w:style w:type="character" w:styleId="Verzeichnissprung">
-    <w:name w:val="Verzeichnissprung"/>
+  <w:style w:type="character" w:styleId="Verzeichnissprunguser">
+    <w:name w:val="Verzeichnissprung (user)"/>
     <w:qFormat/>
     <w:rPr/>
   </w:style>
-  <w:style w:type="character" w:styleId="Nummerierungszeichen">
-    <w:name w:val="Nummerierungszeichen"/>
+  <w:style w:type="character" w:styleId="Nummerierungszeichenuser">
+    <w:name w:val="Nummerierungszeichen (user)"/>
     <w:qFormat/>
     <w:rPr>
       <w:rFonts w:ascii="Arial" w:hAnsi="Arial"/>
@@ -42917,13 +43075,13 @@
       <w:u w:val="single"/>
     </w:rPr>
   </w:style>
-  <w:style w:type="character" w:styleId="Verzeichnissprunguser">
-    <w:name w:val="Verzeichnissprung (user)"/>
+  <w:style w:type="character" w:styleId="Verzeichnissprung">
+    <w:name w:val="Verzeichnissprung"/>
     <w:qFormat/>
     <w:rPr/>
   </w:style>
-  <w:style w:type="character" w:styleId="Aufzhlungszeichenuser">
-    <w:name w:val="Aufzählungszeichen (user)"/>
+  <w:style w:type="character" w:styleId="Aufzhlungszeichen">
+    <w:name w:val="Aufzählungszeichen"/>
     <w:qFormat/>
     <w:rPr>
       <w:rFonts w:ascii="OpenSymbol" w:hAnsi="OpenSymbol" w:eastAsia="OpenSymbol" w:cs="OpenSymbol"/>
@@ -43027,15 +43185,15 @@
     </w:pPr>
     <w:rPr/>
   </w:style>
-  <w:style w:type="paragraph" w:styleId="Kopf-Fuzeile">
-    <w:name w:val="Kopf-/Fußzeile"/>
+  <w:style w:type="paragraph" w:styleId="Kopf-Fuzeileuser">
+    <w:name w:val="Kopf-/Fußzeile (user)"/>
     <w:basedOn w:val="Normal"/>
     <w:qFormat/>
     <w:pPr/>
     <w:rPr/>
   </w:style>
-  <w:style w:type="paragraph" w:styleId="Kopf-Fuzeileuser">
-    <w:name w:val="Kopf-/Fußzeile (user)"/>
+  <w:style w:type="paragraph" w:styleId="Kopf-Fuzeile">
+    <w:name w:val="Kopf-/Fußzeile"/>
     <w:basedOn w:val="Normal"/>
     <w:qFormat/>
     <w:pPr/>
@@ -43051,7 +43209,7 @@
   </w:style>
   <w:style w:type="paragraph" w:styleId="IndexHeading">
     <w:name w:val="index heading"/>
-    <w:basedOn w:val="berschrift"/>
+    <w:basedOn w:val="berschriftuser"/>
     <w:pPr>
       <w:suppressLineNumbers/>
       <w:ind w:hanging="0" w:left="0"/>
@@ -43080,7 +43238,7 @@
   </w:style>
   <w:style w:type="paragraph" w:styleId="TOC1">
     <w:name w:val="toc 1"/>
-    <w:basedOn w:val="Verzeichnis"/>
+    <w:basedOn w:val="Verzeichnisuser"/>
     <w:pPr>
       <w:tabs>
         <w:tab w:val="clear" w:pos="709"/>
@@ -43095,7 +43253,7 @@
   </w:style>
   <w:style w:type="paragraph" w:styleId="TOC2">
     <w:name w:val="toc 2"/>
-    <w:basedOn w:val="Verzeichnis"/>
+    <w:basedOn w:val="Verzeichnisuser"/>
     <w:pPr>
       <w:tabs>
         <w:tab w:val="clear" w:pos="709"/>
@@ -43110,7 +43268,7 @@
   </w:style>
   <w:style w:type="paragraph" w:styleId="TOC3">
     <w:name w:val="toc 3"/>
-    <w:basedOn w:val="Verzeichnis"/>
+    <w:basedOn w:val="Verzeichnisuser"/>
     <w:pPr>
       <w:tabs>
         <w:tab w:val="clear" w:pos="709"/>
@@ -43125,7 +43283,7 @@
   </w:style>
   <w:style w:type="paragraph" w:styleId="TOC4">
     <w:name w:val="toc 4"/>
-    <w:basedOn w:val="Verzeichnis"/>
+    <w:basedOn w:val="Verzeichnisuser"/>
     <w:pPr>
       <w:tabs>
         <w:tab w:val="clear" w:pos="709"/>
@@ -43135,8 +43293,8 @@
     </w:pPr>
     <w:rPr/>
   </w:style>
-  <w:style w:type="paragraph" w:styleId="Tabelleninhalt">
-    <w:name w:val="Tabelleninhalt"/>
+  <w:style w:type="paragraph" w:styleId="Tabelleninhaltuser">
+    <w:name w:val="Tabelleninhalt (user)"/>
     <w:basedOn w:val="Normal"/>
     <w:qFormat/>
     <w:pPr>
@@ -43145,9 +43303,9 @@
     </w:pPr>
     <w:rPr/>
   </w:style>
-  <w:style w:type="paragraph" w:styleId="Tabellenberschrift">
-    <w:name w:val="Tabellenüberschrift"/>
-    <w:basedOn w:val="Tabelleninhalt"/>
+  <w:style w:type="paragraph" w:styleId="Tabellenberschriftuser">
+    <w:name w:val="Tabellenüberschrift (user)"/>
+    <w:basedOn w:val="Tabelleninhaltuser"/>
     <w:qFormat/>
     <w:pPr>
       <w:suppressLineNumbers/>

</xml_diff>